<commit_message>
To Display  Liftside and Rightside Bar with Downstream Overview Inside UesrDashboard
</commit_message>
<xml_diff>
--- a/document/Login as IT Personnel.docx
+++ b/document/Login as IT Personnel.docx
@@ -15,6 +15,46 @@
     </w:p>
     <w:p/>
     <w:p>
+      <w:r>
+        <w:drawing>
+          <wp:inline distT="0" distB="0" distL="0" distR="0" wp14:anchorId="388DEC5C" wp14:editId="43130C66">
+            <wp:extent cx="5943600" cy="3932555"/>
+            <wp:effectExtent l="0" t="0" r="0" b="0"/>
+            <wp:docPr id="1709198302" name="Picture 1"/>
+            <wp:cNvGraphicFramePr>
+              <a:graphicFrameLocks xmlns:a="http://schemas.openxmlformats.org/drawingml/2006/main" noChangeAspect="1"/>
+            </wp:cNvGraphicFramePr>
+            <a:graphic xmlns:a="http://schemas.openxmlformats.org/drawingml/2006/main">
+              <a:graphicData uri="http://schemas.openxmlformats.org/drawingml/2006/picture">
+                <pic:pic xmlns:pic="http://schemas.openxmlformats.org/drawingml/2006/picture">
+                  <pic:nvPicPr>
+                    <pic:cNvPr id="1709198302" name=""/>
+                    <pic:cNvPicPr/>
+                  </pic:nvPicPr>
+                  <pic:blipFill>
+                    <a:blip r:embed="rId5"/>
+                    <a:stretch>
+                      <a:fillRect/>
+                    </a:stretch>
+                  </pic:blipFill>
+                  <pic:spPr>
+                    <a:xfrm>
+                      <a:off x="0" y="0"/>
+                      <a:ext cx="5943600" cy="3932555"/>
+                    </a:xfrm>
+                    <a:prstGeom prst="rect">
+                      <a:avLst/>
+                    </a:prstGeom>
+                  </pic:spPr>
+                </pic:pic>
+              </a:graphicData>
+            </a:graphic>
+          </wp:inline>
+        </w:drawing>
+      </w:r>
+    </w:p>
+    <w:p/>
+    <w:p>
       <w:pPr>
         <w:rPr>
           <w:b/>
@@ -50,6 +90,2419 @@
       <w:proofErr w:type="spellEnd"/>
       <w:r>
         <w:t>/v1"</w:t>
+      </w:r>
+    </w:p>
+    <w:p/>
+    <w:p/>
+    <w:p>
+      <w:r>
+        <w:lastRenderedPageBreak/>
+        <w:drawing>
+          <wp:inline distT="0" distB="0" distL="0" distR="0" wp14:anchorId="43044114" wp14:editId="135676D8">
+            <wp:extent cx="5943600" cy="3174365"/>
+            <wp:effectExtent l="0" t="0" r="0" b="6985"/>
+            <wp:docPr id="99694738" name="Picture 1"/>
+            <wp:cNvGraphicFramePr>
+              <a:graphicFrameLocks xmlns:a="http://schemas.openxmlformats.org/drawingml/2006/main" noChangeAspect="1"/>
+            </wp:cNvGraphicFramePr>
+            <a:graphic xmlns:a="http://schemas.openxmlformats.org/drawingml/2006/main">
+              <a:graphicData uri="http://schemas.openxmlformats.org/drawingml/2006/picture">
+                <pic:pic xmlns:pic="http://schemas.openxmlformats.org/drawingml/2006/picture">
+                  <pic:nvPicPr>
+                    <pic:cNvPr id="99694738" name=""/>
+                    <pic:cNvPicPr/>
+                  </pic:nvPicPr>
+                  <pic:blipFill>
+                    <a:blip r:embed="rId6"/>
+                    <a:stretch>
+                      <a:fillRect/>
+                    </a:stretch>
+                  </pic:blipFill>
+                  <pic:spPr>
+                    <a:xfrm>
+                      <a:off x="0" y="0"/>
+                      <a:ext cx="5943600" cy="3174365"/>
+                    </a:xfrm>
+                    <a:prstGeom prst="rect">
+                      <a:avLst/>
+                    </a:prstGeom>
+                  </pic:spPr>
+                </pic:pic>
+              </a:graphicData>
+            </a:graphic>
+          </wp:inline>
+        </w:drawing>
+      </w:r>
+    </w:p>
+    <w:p/>
+    <w:p/>
+    <w:p/>
+    <w:p>
+      <w:r>
+        <w:t>SELECT</w:t>
+      </w:r>
+    </w:p>
+    <w:p>
+      <w:r>
+        <w:t xml:space="preserve">    </w:t>
+      </w:r>
+      <w:proofErr w:type="spellStart"/>
+      <w:r>
+        <w:t>supervisor_id</w:t>
+      </w:r>
+      <w:proofErr w:type="spellEnd"/>
+      <w:r>
+        <w:t>,</w:t>
+      </w:r>
+    </w:p>
+    <w:p>
+      <w:r>
+        <w:t xml:space="preserve">    </w:t>
+      </w:r>
+      <w:proofErr w:type="gramStart"/>
+      <w:r>
+        <w:t>COUNT(</w:t>
+      </w:r>
+      <w:proofErr w:type="gramEnd"/>
+      <w:r>
+        <w:t xml:space="preserve">*) AS </w:t>
+      </w:r>
+      <w:proofErr w:type="spellStart"/>
+      <w:r>
+        <w:t>downstream_count</w:t>
+      </w:r>
+      <w:proofErr w:type="spellEnd"/>
+    </w:p>
+    <w:p>
+      <w:r>
+        <w:t>FROM (</w:t>
+      </w:r>
+    </w:p>
+    <w:p>
+      <w:r>
+        <w:t xml:space="preserve">    SELECT NULLIF(</w:t>
+      </w:r>
+      <w:proofErr w:type="gramStart"/>
+      <w:r>
+        <w:t>BTRIM(</w:t>
+      </w:r>
+      <w:proofErr w:type="gramEnd"/>
+      <w:r>
+        <w:t>tr1</w:t>
+      </w:r>
+      <w:proofErr w:type="gramStart"/>
+      <w:r>
+        <w:t>), '</w:t>
+      </w:r>
+      <w:proofErr w:type="gramEnd"/>
+      <w:r>
+        <w:t xml:space="preserve">') AS </w:t>
+      </w:r>
+      <w:proofErr w:type="spellStart"/>
+      <w:r>
+        <w:t>supervisor_id</w:t>
+      </w:r>
+      <w:proofErr w:type="spellEnd"/>
+    </w:p>
+    <w:p>
+      <w:r>
+        <w:t xml:space="preserve">    FROM </w:t>
+      </w:r>
+      <w:proofErr w:type="spellStart"/>
+      <w:proofErr w:type="gramStart"/>
+      <w:r>
+        <w:t>public.employee</w:t>
+      </w:r>
+      <w:proofErr w:type="gramEnd"/>
+      <w:r>
+        <w:t>_tier</w:t>
+      </w:r>
+      <w:proofErr w:type="spellEnd"/>
+    </w:p>
+    <w:p/>
+    <w:p>
+      <w:r>
+        <w:t xml:space="preserve">    UNION ALL</w:t>
+      </w:r>
+    </w:p>
+    <w:p/>
+    <w:p>
+      <w:r>
+        <w:t xml:space="preserve">    SELECT NULLIF(</w:t>
+      </w:r>
+      <w:proofErr w:type="gramStart"/>
+      <w:r>
+        <w:t>BTRIM(</w:t>
+      </w:r>
+      <w:proofErr w:type="gramEnd"/>
+      <w:r>
+        <w:t>tr2</w:t>
+      </w:r>
+      <w:proofErr w:type="gramStart"/>
+      <w:r>
+        <w:t>), '</w:t>
+      </w:r>
+      <w:proofErr w:type="gramEnd"/>
+      <w:r>
+        <w:t>')</w:t>
+      </w:r>
+    </w:p>
+    <w:p>
+      <w:r>
+        <w:t xml:space="preserve">    FROM </w:t>
+      </w:r>
+      <w:proofErr w:type="spellStart"/>
+      <w:proofErr w:type="gramStart"/>
+      <w:r>
+        <w:t>public.employee</w:t>
+      </w:r>
+      <w:proofErr w:type="gramEnd"/>
+      <w:r>
+        <w:t>_tier</w:t>
+      </w:r>
+      <w:proofErr w:type="spellEnd"/>
+    </w:p>
+    <w:p/>
+    <w:p>
+      <w:r>
+        <w:lastRenderedPageBreak/>
+        <w:t xml:space="preserve">    UNION ALL</w:t>
+      </w:r>
+    </w:p>
+    <w:p/>
+    <w:p>
+      <w:r>
+        <w:t xml:space="preserve">    SELECT NULLIF(</w:t>
+      </w:r>
+      <w:proofErr w:type="gramStart"/>
+      <w:r>
+        <w:t>BTRIM(</w:t>
+      </w:r>
+      <w:proofErr w:type="gramEnd"/>
+      <w:r>
+        <w:t>tr3), '')</w:t>
+      </w:r>
+    </w:p>
+    <w:p>
+      <w:r>
+        <w:t xml:space="preserve">    FROM </w:t>
+      </w:r>
+      <w:proofErr w:type="spellStart"/>
+      <w:proofErr w:type="gramStart"/>
+      <w:r>
+        <w:t>public.employee</w:t>
+      </w:r>
+      <w:proofErr w:type="gramEnd"/>
+      <w:r>
+        <w:t>_tier</w:t>
+      </w:r>
+      <w:proofErr w:type="spellEnd"/>
+    </w:p>
+    <w:p/>
+    <w:p>
+      <w:r>
+        <w:t xml:space="preserve">    UNION ALL</w:t>
+      </w:r>
+    </w:p>
+    <w:p/>
+    <w:p>
+      <w:r>
+        <w:t xml:space="preserve">    SELECT NULLIF(</w:t>
+      </w:r>
+      <w:proofErr w:type="gramStart"/>
+      <w:r>
+        <w:t>BTRIM(</w:t>
+      </w:r>
+      <w:proofErr w:type="gramEnd"/>
+      <w:r>
+        <w:t>tr4), '')</w:t>
+      </w:r>
+    </w:p>
+    <w:p>
+      <w:r>
+        <w:t xml:space="preserve">    FROM </w:t>
+      </w:r>
+      <w:proofErr w:type="spellStart"/>
+      <w:proofErr w:type="gramStart"/>
+      <w:r>
+        <w:t>public.employee</w:t>
+      </w:r>
+      <w:proofErr w:type="gramEnd"/>
+      <w:r>
+        <w:t>_tier</w:t>
+      </w:r>
+      <w:proofErr w:type="spellEnd"/>
+    </w:p>
+    <w:p/>
+    <w:p>
+      <w:r>
+        <w:t xml:space="preserve">    UNION ALL</w:t>
+      </w:r>
+    </w:p>
+    <w:p/>
+    <w:p>
+      <w:r>
+        <w:t xml:space="preserve">    SELECT NULLIF(</w:t>
+      </w:r>
+      <w:proofErr w:type="gramStart"/>
+      <w:r>
+        <w:t>BTRIM(</w:t>
+      </w:r>
+      <w:proofErr w:type="gramEnd"/>
+      <w:r>
+        <w:t xml:space="preserve">tr5), </w:t>
+      </w:r>
+      <w:proofErr w:type="gramStart"/>
+      <w:r>
+        <w:t>''</w:t>
+      </w:r>
+      <w:proofErr w:type="gramEnd"/>
+      <w:r>
+        <w:t>)</w:t>
+      </w:r>
+    </w:p>
+    <w:p>
+      <w:r>
+        <w:t xml:space="preserve">    FROM </w:t>
+      </w:r>
+      <w:proofErr w:type="spellStart"/>
+      <w:proofErr w:type="gramStart"/>
+      <w:r>
+        <w:t>public.employee</w:t>
+      </w:r>
+      <w:proofErr w:type="gramEnd"/>
+      <w:r>
+        <w:t>_tier</w:t>
+      </w:r>
+      <w:proofErr w:type="spellEnd"/>
+    </w:p>
+    <w:p/>
+    <w:p>
+      <w:r>
+        <w:t xml:space="preserve">    UNION ALL</w:t>
+      </w:r>
+    </w:p>
+    <w:p/>
+    <w:p>
+      <w:r>
+        <w:t xml:space="preserve">    SELECT NULLIF(</w:t>
+      </w:r>
+      <w:proofErr w:type="gramStart"/>
+      <w:r>
+        <w:t>BTRIM(</w:t>
+      </w:r>
+      <w:proofErr w:type="gramEnd"/>
+      <w:r>
+        <w:t>tr6</w:t>
+      </w:r>
+      <w:proofErr w:type="gramStart"/>
+      <w:r>
+        <w:t>), '</w:t>
+      </w:r>
+      <w:proofErr w:type="gramEnd"/>
+      <w:r>
+        <w:t>')</w:t>
+      </w:r>
+    </w:p>
+    <w:p>
+      <w:r>
+        <w:t xml:space="preserve">    FROM </w:t>
+      </w:r>
+      <w:proofErr w:type="spellStart"/>
+      <w:proofErr w:type="gramStart"/>
+      <w:r>
+        <w:t>public.employee</w:t>
+      </w:r>
+      <w:proofErr w:type="gramEnd"/>
+      <w:r>
+        <w:t>_tier</w:t>
+      </w:r>
+      <w:proofErr w:type="spellEnd"/>
+    </w:p>
+    <w:p>
+      <w:r>
+        <w:t>) x</w:t>
+      </w:r>
+    </w:p>
+    <w:p>
+      <w:r>
+        <w:t xml:space="preserve">WHERE </w:t>
+      </w:r>
+      <w:proofErr w:type="spellStart"/>
+      <w:r>
+        <w:t>supervisor_id</w:t>
+      </w:r>
+      <w:proofErr w:type="spellEnd"/>
+      <w:r>
+        <w:t xml:space="preserve"> IS NOT NULL</w:t>
+      </w:r>
+    </w:p>
+    <w:p>
+      <w:r>
+        <w:t xml:space="preserve">GROUP BY </w:t>
+      </w:r>
+      <w:proofErr w:type="spellStart"/>
+      <w:r>
+        <w:t>supervisor_id</w:t>
+      </w:r>
+      <w:proofErr w:type="spellEnd"/>
+    </w:p>
+    <w:p>
+      <w:r>
+        <w:t xml:space="preserve">ORDER BY </w:t>
+      </w:r>
+      <w:proofErr w:type="spellStart"/>
+      <w:r>
+        <w:t>downstream_count</w:t>
+      </w:r>
+      <w:proofErr w:type="spellEnd"/>
+      <w:r>
+        <w:t xml:space="preserve"> DESC</w:t>
+      </w:r>
+    </w:p>
+    <w:p>
+      <w:r>
+        <w:t>LIMIT 20;</w:t>
+      </w:r>
+    </w:p>
+    <w:p/>
+    <w:p>
+      <w:r>
+        <w:lastRenderedPageBreak/>
+        <w:drawing>
+          <wp:inline distT="0" distB="0" distL="0" distR="0" wp14:anchorId="53ECE861" wp14:editId="6E9198D6">
+            <wp:extent cx="5943600" cy="3105150"/>
+            <wp:effectExtent l="0" t="0" r="0" b="0"/>
+            <wp:docPr id="416021153" name="Picture 1"/>
+            <wp:cNvGraphicFramePr>
+              <a:graphicFrameLocks xmlns:a="http://schemas.openxmlformats.org/drawingml/2006/main" noChangeAspect="1"/>
+            </wp:cNvGraphicFramePr>
+            <a:graphic xmlns:a="http://schemas.openxmlformats.org/drawingml/2006/main">
+              <a:graphicData uri="http://schemas.openxmlformats.org/drawingml/2006/picture">
+                <pic:pic xmlns:pic="http://schemas.openxmlformats.org/drawingml/2006/picture">
+                  <pic:nvPicPr>
+                    <pic:cNvPr id="416021153" name=""/>
+                    <pic:cNvPicPr/>
+                  </pic:nvPicPr>
+                  <pic:blipFill>
+                    <a:blip r:embed="rId7"/>
+                    <a:stretch>
+                      <a:fillRect/>
+                    </a:stretch>
+                  </pic:blipFill>
+                  <pic:spPr>
+                    <a:xfrm>
+                      <a:off x="0" y="0"/>
+                      <a:ext cx="5943600" cy="3105150"/>
+                    </a:xfrm>
+                    <a:prstGeom prst="rect">
+                      <a:avLst/>
+                    </a:prstGeom>
+                  </pic:spPr>
+                </pic:pic>
+              </a:graphicData>
+            </a:graphic>
+          </wp:inline>
+        </w:drawing>
+      </w:r>
+    </w:p>
+    <w:p/>
+    <w:p/>
+    <w:p/>
+    <w:p/>
+    <w:p/>
+    <w:p/>
+    <w:p/>
+    <w:p/>
+    <w:p/>
+    <w:p/>
+    <w:p/>
+    <w:p>
+      <w:r>
+        <w:t>SELECT</w:t>
+      </w:r>
+    </w:p>
+    <w:p>
+      <w:r>
+        <w:t xml:space="preserve">    </w:t>
+      </w:r>
+      <w:proofErr w:type="gramStart"/>
+      <w:r>
+        <w:t>COUNT(</w:t>
+      </w:r>
+      <w:proofErr w:type="gramEnd"/>
+      <w:r>
+        <w:t xml:space="preserve">DISTINCT </w:t>
+      </w:r>
+      <w:proofErr w:type="spellStart"/>
+      <w:proofErr w:type="gramStart"/>
+      <w:r>
+        <w:t>et.employee</w:t>
+      </w:r>
+      <w:proofErr w:type="gramEnd"/>
+      <w:r>
+        <w:t>_id</w:t>
+      </w:r>
+      <w:proofErr w:type="spellEnd"/>
+      <w:r>
+        <w:t xml:space="preserve">) AS </w:t>
+      </w:r>
+      <w:proofErr w:type="spellStart"/>
+      <w:r>
+        <w:t>total_downstream_employees</w:t>
+      </w:r>
+      <w:proofErr w:type="spellEnd"/>
+      <w:r>
+        <w:t>,</w:t>
+      </w:r>
+    </w:p>
+    <w:p/>
+    <w:p>
+      <w:r>
+        <w:t xml:space="preserve">    </w:t>
+      </w:r>
+      <w:proofErr w:type="gramStart"/>
+      <w:r>
+        <w:t>COUNT(</w:t>
+      </w:r>
+      <w:proofErr w:type="gramEnd"/>
+    </w:p>
+    <w:p>
+      <w:r>
+        <w:t xml:space="preserve">        DISTINCT CASE</w:t>
+      </w:r>
+    </w:p>
+    <w:p>
+      <w:r>
+        <w:lastRenderedPageBreak/>
+        <w:t xml:space="preserve">            WHEN </w:t>
+      </w:r>
+      <w:proofErr w:type="gramStart"/>
+      <w:r>
+        <w:t>BTRIM(</w:t>
+      </w:r>
+      <w:proofErr w:type="gramEnd"/>
+    </w:p>
+    <w:p>
+      <w:r>
+        <w:t xml:space="preserve">                </w:t>
+      </w:r>
+      <w:proofErr w:type="gramStart"/>
+      <w:r>
+        <w:t>COALESCE(</w:t>
+      </w:r>
+      <w:proofErr w:type="gramEnd"/>
+      <w:r>
+        <w:t>et.tr1, '')</w:t>
+      </w:r>
+    </w:p>
+    <w:p>
+      <w:r>
+        <w:t xml:space="preserve">            ) = '02-0003'</w:t>
+      </w:r>
+    </w:p>
+    <w:p>
+      <w:r>
+        <w:t xml:space="preserve">            THEN </w:t>
+      </w:r>
+      <w:proofErr w:type="spellStart"/>
+      <w:proofErr w:type="gramStart"/>
+      <w:r>
+        <w:t>et.employee</w:t>
+      </w:r>
+      <w:proofErr w:type="gramEnd"/>
+      <w:r>
+        <w:t>_id</w:t>
+      </w:r>
+      <w:proofErr w:type="spellEnd"/>
+    </w:p>
+    <w:p>
+      <w:r>
+        <w:t xml:space="preserve">        END</w:t>
+      </w:r>
+    </w:p>
+    <w:p>
+      <w:r>
+        <w:t xml:space="preserve">    ) AS </w:t>
+      </w:r>
+      <w:proofErr w:type="spellStart"/>
+      <w:r>
+        <w:t>direct_downstream_employees</w:t>
+      </w:r>
+      <w:proofErr w:type="spellEnd"/>
+    </w:p>
+    <w:p/>
+    <w:p>
+      <w:r>
+        <w:t xml:space="preserve">FROM </w:t>
+      </w:r>
+      <w:proofErr w:type="spellStart"/>
+      <w:proofErr w:type="gramStart"/>
+      <w:r>
+        <w:t>public.employee</w:t>
+      </w:r>
+      <w:proofErr w:type="gramEnd"/>
+      <w:r>
+        <w:t>_tier</w:t>
+      </w:r>
+      <w:proofErr w:type="spellEnd"/>
+      <w:r>
+        <w:t xml:space="preserve"> et</w:t>
+      </w:r>
+    </w:p>
+    <w:p/>
+    <w:p>
+      <w:proofErr w:type="gramStart"/>
+      <w:r>
+        <w:t>WHERE</w:t>
+      </w:r>
+      <w:proofErr w:type="gramEnd"/>
+    </w:p>
+    <w:p>
+      <w:r>
+        <w:t xml:space="preserve">       </w:t>
+      </w:r>
+      <w:proofErr w:type="gramStart"/>
+      <w:r>
+        <w:t>BTRIM(COALESCE(et.tr1, '</w:t>
+      </w:r>
+      <w:proofErr w:type="gramEnd"/>
+      <w:r>
+        <w:t>')) = '02-0003'</w:t>
+      </w:r>
+    </w:p>
+    <w:p>
+      <w:r>
+        <w:t xml:space="preserve">    OR </w:t>
+      </w:r>
+      <w:proofErr w:type="gramStart"/>
+      <w:r>
+        <w:t>BTRIM(COALESCE(et.tr2, '</w:t>
+      </w:r>
+      <w:proofErr w:type="gramEnd"/>
+      <w:r>
+        <w:t>')) = '02-0003'</w:t>
+      </w:r>
+    </w:p>
+    <w:p>
+      <w:r>
+        <w:t xml:space="preserve">    OR </w:t>
+      </w:r>
+      <w:proofErr w:type="gramStart"/>
+      <w:r>
+        <w:t>BTRIM(COALESCE(et.tr3, '</w:t>
+      </w:r>
+      <w:proofErr w:type="gramEnd"/>
+      <w:r>
+        <w:t>')) = '02-0003'</w:t>
+      </w:r>
+    </w:p>
+    <w:p>
+      <w:r>
+        <w:t xml:space="preserve">    OR </w:t>
+      </w:r>
+      <w:proofErr w:type="gramStart"/>
+      <w:r>
+        <w:t>BTRIM(COALESCE(</w:t>
+      </w:r>
+      <w:proofErr w:type="gramEnd"/>
+      <w:r>
+        <w:t>et.tr4, '')) = '02-0003'</w:t>
+      </w:r>
+    </w:p>
+    <w:p>
+      <w:r>
+        <w:t xml:space="preserve">    OR </w:t>
+      </w:r>
+      <w:proofErr w:type="gramStart"/>
+      <w:r>
+        <w:t>BTRIM(COALESCE(</w:t>
+      </w:r>
+      <w:proofErr w:type="gramEnd"/>
+      <w:r>
+        <w:t>et.tr5, '')) = '02-0003'</w:t>
+      </w:r>
+    </w:p>
+    <w:p>
+      <w:r>
+        <w:t xml:space="preserve">    OR </w:t>
+      </w:r>
+      <w:proofErr w:type="gramStart"/>
+      <w:r>
+        <w:t>BTRIM(COALESCE(</w:t>
+      </w:r>
+      <w:proofErr w:type="gramEnd"/>
+      <w:r>
+        <w:t>et.tr6, '')) = '02-0003';</w:t>
+      </w:r>
+    </w:p>
+    <w:p/>
+    <w:p/>
+    <w:p>
+      <w:r>
+        <w:lastRenderedPageBreak/>
+        <w:drawing>
+          <wp:inline distT="0" distB="0" distL="0" distR="0" wp14:anchorId="245013B7" wp14:editId="2A283F32">
+            <wp:extent cx="5943600" cy="3192145"/>
+            <wp:effectExtent l="0" t="0" r="0" b="8255"/>
+            <wp:docPr id="767003443" name="Picture 1"/>
+            <wp:cNvGraphicFramePr>
+              <a:graphicFrameLocks xmlns:a="http://schemas.openxmlformats.org/drawingml/2006/main" noChangeAspect="1"/>
+            </wp:cNvGraphicFramePr>
+            <a:graphic xmlns:a="http://schemas.openxmlformats.org/drawingml/2006/main">
+              <a:graphicData uri="http://schemas.openxmlformats.org/drawingml/2006/picture">
+                <pic:pic xmlns:pic="http://schemas.openxmlformats.org/drawingml/2006/picture">
+                  <pic:nvPicPr>
+                    <pic:cNvPr id="767003443" name=""/>
+                    <pic:cNvPicPr/>
+                  </pic:nvPicPr>
+                  <pic:blipFill>
+                    <a:blip r:embed="rId8"/>
+                    <a:stretch>
+                      <a:fillRect/>
+                    </a:stretch>
+                  </pic:blipFill>
+                  <pic:spPr>
+                    <a:xfrm>
+                      <a:off x="0" y="0"/>
+                      <a:ext cx="5943600" cy="3192145"/>
+                    </a:xfrm>
+                    <a:prstGeom prst="rect">
+                      <a:avLst/>
+                    </a:prstGeom>
+                  </pic:spPr>
+                </pic:pic>
+              </a:graphicData>
+            </a:graphic>
+          </wp:inline>
+        </w:drawing>
+      </w:r>
+    </w:p>
+    <w:p>
+      <w:pPr>
+        <w:rPr>
+          <w:b/>
+          <w:bCs/>
+        </w:rPr>
+      </w:pPr>
+    </w:p>
+    <w:p>
+      <w:pPr>
+        <w:rPr>
+          <w:b/>
+          <w:bCs/>
+        </w:rPr>
+      </w:pPr>
+      <w:r>
+        <w:rPr>
+          <w:b/>
+          <w:bCs/>
+        </w:rPr>
+        <w:t>Downstream in postman</w:t>
+      </w:r>
+    </w:p>
+    <w:p>
+      <w:proofErr w:type="gramStart"/>
+      <w:r>
+        <w:t>Method :</w:t>
+      </w:r>
+      <w:proofErr w:type="gramEnd"/>
+      <w:r>
+        <w:t xml:space="preserve"> Get</w:t>
+      </w:r>
+    </w:p>
+    <w:p>
+      <w:r>
+        <w:t>http://127.0.0.1:8080/api/v1/user/downstream-summary</w:t>
+      </w:r>
+    </w:p>
+    <w:p>
+      <w:r>
+        <w:drawing>
+          <wp:inline distT="0" distB="0" distL="0" distR="0" wp14:anchorId="791B2043" wp14:editId="110C9E03">
+            <wp:extent cx="5943600" cy="3207385"/>
+            <wp:effectExtent l="0" t="0" r="0" b="0"/>
+            <wp:docPr id="735518706" name="Picture 1"/>
+            <wp:cNvGraphicFramePr>
+              <a:graphicFrameLocks xmlns:a="http://schemas.openxmlformats.org/drawingml/2006/main" noChangeAspect="1"/>
+            </wp:cNvGraphicFramePr>
+            <a:graphic xmlns:a="http://schemas.openxmlformats.org/drawingml/2006/main">
+              <a:graphicData uri="http://schemas.openxmlformats.org/drawingml/2006/picture">
+                <pic:pic xmlns:pic="http://schemas.openxmlformats.org/drawingml/2006/picture">
+                  <pic:nvPicPr>
+                    <pic:cNvPr id="735518706" name=""/>
+                    <pic:cNvPicPr/>
+                  </pic:nvPicPr>
+                  <pic:blipFill>
+                    <a:blip r:embed="rId9"/>
+                    <a:stretch>
+                      <a:fillRect/>
+                    </a:stretch>
+                  </pic:blipFill>
+                  <pic:spPr>
+                    <a:xfrm>
+                      <a:off x="0" y="0"/>
+                      <a:ext cx="5943600" cy="3207385"/>
+                    </a:xfrm>
+                    <a:prstGeom prst="rect">
+                      <a:avLst/>
+                    </a:prstGeom>
+                  </pic:spPr>
+                </pic:pic>
+              </a:graphicData>
+            </a:graphic>
+          </wp:inline>
+        </w:drawing>
+      </w:r>
+    </w:p>
+    <w:p/>
+    <w:p/>
+    <w:p/>
+    <w:p>
+      <w:hyperlink r:id="rId10" w:history="1">
+        <w:r>
+          <w:rPr>
+            <w:rStyle w:val="Hyperlink"/>
+          </w:rPr>
+          <w:t>http://127.0.0.1:8080/api/v1/user/downstream-summary</w:t>
+        </w:r>
+      </w:hyperlink>
+    </w:p>
+    <w:p/>
+    <w:p>
+      <w:r>
+        <w:drawing>
+          <wp:inline distT="0" distB="0" distL="0" distR="0" wp14:anchorId="7E678D82" wp14:editId="391611B9">
+            <wp:extent cx="5943600" cy="3164205"/>
+            <wp:effectExtent l="0" t="0" r="0" b="0"/>
+            <wp:docPr id="1634563200" name="Picture 1"/>
+            <wp:cNvGraphicFramePr>
+              <a:graphicFrameLocks xmlns:a="http://schemas.openxmlformats.org/drawingml/2006/main" noChangeAspect="1"/>
+            </wp:cNvGraphicFramePr>
+            <a:graphic xmlns:a="http://schemas.openxmlformats.org/drawingml/2006/main">
+              <a:graphicData uri="http://schemas.openxmlformats.org/drawingml/2006/picture">
+                <pic:pic xmlns:pic="http://schemas.openxmlformats.org/drawingml/2006/picture">
+                  <pic:nvPicPr>
+                    <pic:cNvPr id="1634563200" name=""/>
+                    <pic:cNvPicPr/>
+                  </pic:nvPicPr>
+                  <pic:blipFill>
+                    <a:blip r:embed="rId11"/>
+                    <a:stretch>
+                      <a:fillRect/>
+                    </a:stretch>
+                  </pic:blipFill>
+                  <pic:spPr>
+                    <a:xfrm>
+                      <a:off x="0" y="0"/>
+                      <a:ext cx="5943600" cy="3164205"/>
+                    </a:xfrm>
+                    <a:prstGeom prst="rect">
+                      <a:avLst/>
+                    </a:prstGeom>
+                  </pic:spPr>
+                </pic:pic>
+              </a:graphicData>
+            </a:graphic>
+          </wp:inline>
+        </w:drawing>
+      </w:r>
+    </w:p>
+    <w:p/>
+    <w:p>
+      <w:r>
+        <w:t xml:space="preserve">GET </w:t>
+      </w:r>
+      <w:hyperlink r:id="rId12" w:history="1">
+        <w:r>
+          <w:rPr>
+            <w:rStyle w:val="Hyperlink"/>
+          </w:rPr>
+          <w:t>http://127.0.0.1:8080/api/v1/auth/me</w:t>
+        </w:r>
+      </w:hyperlink>
+    </w:p>
+    <w:p/>
+    <w:p>
+      <w:r>
+        <w:t>{</w:t>
+      </w:r>
+    </w:p>
+    <w:p>
+      <w:r>
+        <w:t>    "data</w:t>
+      </w:r>
+      <w:proofErr w:type="gramStart"/>
+      <w:r>
+        <w:t>": {</w:t>
+      </w:r>
+      <w:proofErr w:type="gramEnd"/>
+    </w:p>
+    <w:p>
+      <w:r>
+        <w:t>        "</w:t>
+      </w:r>
+      <w:proofErr w:type="spellStart"/>
+      <w:proofErr w:type="gramStart"/>
+      <w:r>
+        <w:t>account</w:t>
+      </w:r>
+      <w:proofErr w:type="gramEnd"/>
+      <w:r>
+        <w:t>_status</w:t>
+      </w:r>
+      <w:proofErr w:type="spellEnd"/>
+      <w:r>
+        <w:t>": "active",</w:t>
+      </w:r>
+    </w:p>
+    <w:p>
+      <w:r>
+        <w:t>        "email": "</w:t>
+      </w:r>
+      <w:proofErr w:type="spellStart"/>
+      <w:r>
+        <w:t>test.general@itm.local</w:t>
+      </w:r>
+      <w:proofErr w:type="spellEnd"/>
+      <w:r>
+        <w:t>",</w:t>
+      </w:r>
+    </w:p>
+    <w:p>
+      <w:r>
+        <w:t>        "</w:t>
+      </w:r>
+      <w:proofErr w:type="spellStart"/>
+      <w:proofErr w:type="gramStart"/>
+      <w:r>
+        <w:t>employee</w:t>
+      </w:r>
+      <w:proofErr w:type="gramEnd"/>
+      <w:r>
+        <w:t>_id</w:t>
+      </w:r>
+      <w:proofErr w:type="spellEnd"/>
+      <w:r>
+        <w:t>": "02-0908",</w:t>
+      </w:r>
+    </w:p>
+    <w:p>
+      <w:r>
+        <w:t>        "</w:t>
+      </w:r>
+      <w:proofErr w:type="spellStart"/>
+      <w:proofErr w:type="gramStart"/>
+      <w:r>
+        <w:t>full</w:t>
+      </w:r>
+      <w:proofErr w:type="gramEnd"/>
+      <w:r>
+        <w:t>_name</w:t>
+      </w:r>
+      <w:proofErr w:type="spellEnd"/>
+      <w:r>
+        <w:t>": "Test General User",</w:t>
+      </w:r>
+    </w:p>
+    <w:p>
+      <w:r>
+        <w:t>        "</w:t>
+      </w:r>
+      <w:proofErr w:type="spellStart"/>
+      <w:proofErr w:type="gramStart"/>
+      <w:r>
+        <w:t>must</w:t>
+      </w:r>
+      <w:proofErr w:type="gramEnd"/>
+      <w:r>
+        <w:t>_change_password</w:t>
+      </w:r>
+      <w:proofErr w:type="spellEnd"/>
+      <w:r>
+        <w:t>": </w:t>
+      </w:r>
+      <w:r>
+        <w:rPr>
+          <w:b/>
+          <w:bCs/>
+        </w:rPr>
+        <w:t>true</w:t>
+      </w:r>
+      <w:r>
+        <w:t>,</w:t>
+      </w:r>
+    </w:p>
+    <w:p>
+      <w:r>
+        <w:t>        "permissions": [</w:t>
+      </w:r>
+    </w:p>
+    <w:p>
+      <w:r>
+        <w:lastRenderedPageBreak/>
+        <w:t>            "</w:t>
+      </w:r>
+      <w:proofErr w:type="spellStart"/>
+      <w:proofErr w:type="gramStart"/>
+      <w:r>
+        <w:t>dashboard.self</w:t>
+      </w:r>
+      <w:proofErr w:type="gramEnd"/>
+      <w:r>
+        <w:t>.access</w:t>
+      </w:r>
+      <w:proofErr w:type="spellEnd"/>
+      <w:r>
+        <w:t>"</w:t>
+      </w:r>
+    </w:p>
+    <w:p>
+      <w:r>
+        <w:t>        ],</w:t>
+      </w:r>
+    </w:p>
+    <w:p>
+      <w:r>
+        <w:t>        "</w:t>
+      </w:r>
+      <w:proofErr w:type="spellStart"/>
+      <w:proofErr w:type="gramStart"/>
+      <w:r>
+        <w:t>role</w:t>
+      </w:r>
+      <w:proofErr w:type="gramEnd"/>
+      <w:r>
+        <w:t>_code</w:t>
+      </w:r>
+      <w:proofErr w:type="spellEnd"/>
+      <w:r>
+        <w:t>": "GENERAL_USER",</w:t>
+      </w:r>
+    </w:p>
+    <w:p>
+      <w:r>
+        <w:t>        "</w:t>
+      </w:r>
+      <w:proofErr w:type="spellStart"/>
+      <w:proofErr w:type="gramStart"/>
+      <w:r>
+        <w:t>role</w:t>
+      </w:r>
+      <w:proofErr w:type="gramEnd"/>
+      <w:r>
+        <w:t>_name</w:t>
+      </w:r>
+      <w:proofErr w:type="spellEnd"/>
+      <w:r>
+        <w:t>": "General User",</w:t>
+      </w:r>
+    </w:p>
+    <w:p>
+      <w:r>
+        <w:t>        "</w:t>
+      </w:r>
+      <w:proofErr w:type="spellStart"/>
+      <w:proofErr w:type="gramStart"/>
+      <w:r>
+        <w:t>user</w:t>
+      </w:r>
+      <w:proofErr w:type="gramEnd"/>
+      <w:r>
+        <w:t>_id</w:t>
+      </w:r>
+      <w:proofErr w:type="spellEnd"/>
+      <w:r>
+        <w:t>": 4,</w:t>
+      </w:r>
+    </w:p>
+    <w:p>
+      <w:r>
+        <w:t>        "</w:t>
+      </w:r>
+      <w:proofErr w:type="spellStart"/>
+      <w:proofErr w:type="gramStart"/>
+      <w:r>
+        <w:t>user</w:t>
+      </w:r>
+      <w:proofErr w:type="gramEnd"/>
+      <w:r>
+        <w:t>_type</w:t>
+      </w:r>
+      <w:proofErr w:type="spellEnd"/>
+      <w:r>
+        <w:t>": 3,</w:t>
+      </w:r>
+    </w:p>
+    <w:p>
+      <w:r>
+        <w:t>        "username": "</w:t>
+      </w:r>
+      <w:proofErr w:type="spellStart"/>
+      <w:proofErr w:type="gramStart"/>
+      <w:r>
+        <w:t>test.general</w:t>
+      </w:r>
+      <w:proofErr w:type="spellEnd"/>
+      <w:proofErr w:type="gramEnd"/>
+      <w:r>
+        <w:t>"</w:t>
+      </w:r>
+    </w:p>
+    <w:p>
+      <w:r>
+        <w:t>    },</w:t>
+      </w:r>
+    </w:p>
+    <w:p>
+      <w:r>
+        <w:t>    "success": </w:t>
+      </w:r>
+      <w:r>
+        <w:rPr>
+          <w:b/>
+          <w:bCs/>
+        </w:rPr>
+        <w:t>true</w:t>
+      </w:r>
+    </w:p>
+    <w:p>
+      <w:r>
+        <w:t>}</w:t>
+      </w:r>
+    </w:p>
+    <w:p/>
+    <w:p/>
+    <w:p>
+      <w:r>
+        <w:t>SELECT</w:t>
+      </w:r>
+    </w:p>
+    <w:p>
+      <w:r>
+        <w:t xml:space="preserve">    </w:t>
+      </w:r>
+      <w:proofErr w:type="gramStart"/>
+      <w:r>
+        <w:t>COUNT(</w:t>
+      </w:r>
+      <w:proofErr w:type="gramEnd"/>
+    </w:p>
+    <w:p>
+      <w:r>
+        <w:t xml:space="preserve">        DISTINCT CASE</w:t>
+      </w:r>
+    </w:p>
+    <w:p>
+      <w:r>
+        <w:t xml:space="preserve">            WHEN </w:t>
+      </w:r>
+      <w:proofErr w:type="gramStart"/>
+      <w:r>
+        <w:t>BTRIM(COALESCE(</w:t>
+      </w:r>
+      <w:proofErr w:type="gramEnd"/>
+      <w:r>
+        <w:t>et.tr1, '')) = '02-0003'</w:t>
+      </w:r>
+    </w:p>
+    <w:p>
+      <w:r>
+        <w:t xml:space="preserve">            THEN </w:t>
+      </w:r>
+      <w:proofErr w:type="gramStart"/>
+      <w:r>
+        <w:t>BTRIM(</w:t>
+      </w:r>
+      <w:proofErr w:type="spellStart"/>
+      <w:r>
+        <w:t>et.employee</w:t>
+      </w:r>
+      <w:proofErr w:type="gramEnd"/>
+      <w:r>
+        <w:t>_id</w:t>
+      </w:r>
+      <w:proofErr w:type="spellEnd"/>
+      <w:r>
+        <w:t>)</w:t>
+      </w:r>
+    </w:p>
+    <w:p>
+      <w:r>
+        <w:t xml:space="preserve">        END</w:t>
+      </w:r>
+    </w:p>
+    <w:p>
+      <w:r>
+        <w:t xml:space="preserve">    ) AS </w:t>
+      </w:r>
+      <w:proofErr w:type="spellStart"/>
+      <w:r>
+        <w:t>direct_downstream_employees</w:t>
+      </w:r>
+      <w:proofErr w:type="spellEnd"/>
+      <w:r>
+        <w:t>,</w:t>
+      </w:r>
+    </w:p>
+    <w:p/>
+    <w:p>
+      <w:r>
+        <w:t xml:space="preserve">    </w:t>
+      </w:r>
+      <w:proofErr w:type="gramStart"/>
+      <w:r>
+        <w:t>COUNT(</w:t>
+      </w:r>
+      <w:proofErr w:type="gramEnd"/>
+    </w:p>
+    <w:p>
+      <w:r>
+        <w:t xml:space="preserve">        DISTINCT </w:t>
+      </w:r>
+      <w:proofErr w:type="gramStart"/>
+      <w:r>
+        <w:t>BTRIM(</w:t>
+      </w:r>
+      <w:proofErr w:type="spellStart"/>
+      <w:r>
+        <w:t>et.employee</w:t>
+      </w:r>
+      <w:proofErr w:type="gramEnd"/>
+      <w:r>
+        <w:t>_id</w:t>
+      </w:r>
+      <w:proofErr w:type="spellEnd"/>
+      <w:r>
+        <w:t>)</w:t>
+      </w:r>
+    </w:p>
+    <w:p>
+      <w:r>
+        <w:t xml:space="preserve">    ) AS </w:t>
+      </w:r>
+      <w:proofErr w:type="spellStart"/>
+      <w:r>
+        <w:t>all_downstream_employees</w:t>
+      </w:r>
+      <w:proofErr w:type="spellEnd"/>
+    </w:p>
+    <w:p/>
+    <w:p>
+      <w:r>
+        <w:t xml:space="preserve">FROM </w:t>
+      </w:r>
+      <w:proofErr w:type="spellStart"/>
+      <w:proofErr w:type="gramStart"/>
+      <w:r>
+        <w:t>public.employee</w:t>
+      </w:r>
+      <w:proofErr w:type="gramEnd"/>
+      <w:r>
+        <w:t>_tier</w:t>
+      </w:r>
+      <w:proofErr w:type="spellEnd"/>
+      <w:r>
+        <w:t xml:space="preserve"> et</w:t>
+      </w:r>
+    </w:p>
+    <w:p/>
+    <w:p>
+      <w:proofErr w:type="gramStart"/>
+      <w:r>
+        <w:lastRenderedPageBreak/>
+        <w:t>WHERE</w:t>
+      </w:r>
+      <w:proofErr w:type="gramEnd"/>
+    </w:p>
+    <w:p>
+      <w:r>
+        <w:t xml:space="preserve">       </w:t>
+      </w:r>
+      <w:proofErr w:type="gramStart"/>
+      <w:r>
+        <w:t>BTRIM(COALESCE(et.tr1, '</w:t>
+      </w:r>
+      <w:proofErr w:type="gramEnd"/>
+      <w:r>
+        <w:t>')) = '02-0003'</w:t>
+      </w:r>
+    </w:p>
+    <w:p>
+      <w:r>
+        <w:t xml:space="preserve">    OR </w:t>
+      </w:r>
+      <w:proofErr w:type="gramStart"/>
+      <w:r>
+        <w:t>BTRIM(COALESCE(et.tr2, '</w:t>
+      </w:r>
+      <w:proofErr w:type="gramEnd"/>
+      <w:r>
+        <w:t>')) = '02-0003'</w:t>
+      </w:r>
+    </w:p>
+    <w:p>
+      <w:r>
+        <w:t xml:space="preserve">    OR </w:t>
+      </w:r>
+      <w:proofErr w:type="gramStart"/>
+      <w:r>
+        <w:t>BTRIM(COALESCE(et.tr3, '</w:t>
+      </w:r>
+      <w:proofErr w:type="gramEnd"/>
+      <w:r>
+        <w:t>')) = '02-0003'</w:t>
+      </w:r>
+    </w:p>
+    <w:p>
+      <w:r>
+        <w:t xml:space="preserve">    OR </w:t>
+      </w:r>
+      <w:proofErr w:type="gramStart"/>
+      <w:r>
+        <w:t>BTRIM(COALESCE(</w:t>
+      </w:r>
+      <w:proofErr w:type="gramEnd"/>
+      <w:r>
+        <w:t>et.tr4, '')) = '02-0003'</w:t>
+      </w:r>
+    </w:p>
+    <w:p>
+      <w:r>
+        <w:t xml:space="preserve">    OR </w:t>
+      </w:r>
+      <w:proofErr w:type="gramStart"/>
+      <w:r>
+        <w:t>BTRIM(COALESCE(</w:t>
+      </w:r>
+      <w:proofErr w:type="gramEnd"/>
+      <w:r>
+        <w:t>et.tr5, '')) = '02-0003'</w:t>
+      </w:r>
+    </w:p>
+    <w:p>
+      <w:r>
+        <w:t xml:space="preserve">    OR </w:t>
+      </w:r>
+      <w:proofErr w:type="gramStart"/>
+      <w:r>
+        <w:t>BTRIM(COALESCE(</w:t>
+      </w:r>
+      <w:proofErr w:type="gramEnd"/>
+      <w:r>
+        <w:t>et.tr6, '')) = '02-0003';</w:t>
+      </w:r>
+    </w:p>
+    <w:p/>
+    <w:p>
+      <w:r>
+        <w:drawing>
+          <wp:inline distT="0" distB="0" distL="0" distR="0" wp14:anchorId="6953D560" wp14:editId="4BFBC959">
+            <wp:extent cx="5943600" cy="3176905"/>
+            <wp:effectExtent l="0" t="0" r="0" b="4445"/>
+            <wp:docPr id="1822180003" name="Picture 1"/>
+            <wp:cNvGraphicFramePr>
+              <a:graphicFrameLocks xmlns:a="http://schemas.openxmlformats.org/drawingml/2006/main" noChangeAspect="1"/>
+            </wp:cNvGraphicFramePr>
+            <a:graphic xmlns:a="http://schemas.openxmlformats.org/drawingml/2006/main">
+              <a:graphicData uri="http://schemas.openxmlformats.org/drawingml/2006/picture">
+                <pic:pic xmlns:pic="http://schemas.openxmlformats.org/drawingml/2006/picture">
+                  <pic:nvPicPr>
+                    <pic:cNvPr id="1822180003" name=""/>
+                    <pic:cNvPicPr/>
+                  </pic:nvPicPr>
+                  <pic:blipFill>
+                    <a:blip r:embed="rId13"/>
+                    <a:stretch>
+                      <a:fillRect/>
+                    </a:stretch>
+                  </pic:blipFill>
+                  <pic:spPr>
+                    <a:xfrm>
+                      <a:off x="0" y="0"/>
+                      <a:ext cx="5943600" cy="3176905"/>
+                    </a:xfrm>
+                    <a:prstGeom prst="rect">
+                      <a:avLst/>
+                    </a:prstGeom>
+                  </pic:spPr>
+                </pic:pic>
+              </a:graphicData>
+            </a:graphic>
+          </wp:inline>
+        </w:drawing>
+      </w:r>
+    </w:p>
+    <w:p/>
+    <w:p/>
+    <w:p/>
+    <w:p/>
+    <w:p/>
+    <w:p/>
+    <w:p/>
+    <w:p>
+      <w:pPr>
+        <w:rPr>
+          <w:b/>
+          <w:bCs/>
+        </w:rPr>
+      </w:pPr>
+      <w:r>
+        <w:rPr>
+          <w:b/>
+          <w:bCs/>
+        </w:rPr>
+        <w:lastRenderedPageBreak/>
+        <w:t>Postman</w:t>
+      </w:r>
+    </w:p>
+    <w:p/>
+    <w:p>
+      <w:hyperlink r:id="rId14" w:history="1">
+        <w:r>
+          <w:rPr>
+            <w:rStyle w:val="Hyperlink"/>
+          </w:rPr>
+          <w:t>http://127.0.0.1:8080/api/v1/auth/me</w:t>
+        </w:r>
+      </w:hyperlink>
+    </w:p>
+    <w:p>
+      <w:r>
+        <w:t>{</w:t>
+      </w:r>
+    </w:p>
+    <w:p>
+      <w:r>
+        <w:t>    "data</w:t>
+      </w:r>
+      <w:proofErr w:type="gramStart"/>
+      <w:r>
+        <w:t>": {</w:t>
+      </w:r>
+      <w:proofErr w:type="gramEnd"/>
+    </w:p>
+    <w:p>
+      <w:r>
+        <w:t>        "</w:t>
+      </w:r>
+      <w:proofErr w:type="spellStart"/>
+      <w:proofErr w:type="gramStart"/>
+      <w:r>
+        <w:t>account</w:t>
+      </w:r>
+      <w:proofErr w:type="gramEnd"/>
+      <w:r>
+        <w:t>_status</w:t>
+      </w:r>
+      <w:proofErr w:type="spellEnd"/>
+      <w:r>
+        <w:t>": "active",</w:t>
+      </w:r>
+    </w:p>
+    <w:p>
+      <w:r>
+        <w:t>        "email": "</w:t>
+      </w:r>
+      <w:proofErr w:type="spellStart"/>
+      <w:r>
+        <w:t>test.general@itm.local</w:t>
+      </w:r>
+      <w:proofErr w:type="spellEnd"/>
+      <w:r>
+        <w:t>",</w:t>
+      </w:r>
+    </w:p>
+    <w:p>
+      <w:r>
+        <w:t>        "</w:t>
+      </w:r>
+      <w:proofErr w:type="spellStart"/>
+      <w:proofErr w:type="gramStart"/>
+      <w:r>
+        <w:t>employee</w:t>
+      </w:r>
+      <w:proofErr w:type="gramEnd"/>
+      <w:r>
+        <w:t>_id</w:t>
+      </w:r>
+      <w:proofErr w:type="spellEnd"/>
+      <w:r>
+        <w:t>": "02-0003",</w:t>
+      </w:r>
+    </w:p>
+    <w:p>
+      <w:r>
+        <w:t>        "</w:t>
+      </w:r>
+      <w:proofErr w:type="spellStart"/>
+      <w:proofErr w:type="gramStart"/>
+      <w:r>
+        <w:t>full</w:t>
+      </w:r>
+      <w:proofErr w:type="gramEnd"/>
+      <w:r>
+        <w:t>_name</w:t>
+      </w:r>
+      <w:proofErr w:type="spellEnd"/>
+      <w:r>
+        <w:t>": "Test General User",</w:t>
+      </w:r>
+    </w:p>
+    <w:p>
+      <w:r>
+        <w:t>        "</w:t>
+      </w:r>
+      <w:proofErr w:type="spellStart"/>
+      <w:proofErr w:type="gramStart"/>
+      <w:r>
+        <w:t>must</w:t>
+      </w:r>
+      <w:proofErr w:type="gramEnd"/>
+      <w:r>
+        <w:t>_change_password</w:t>
+      </w:r>
+      <w:proofErr w:type="spellEnd"/>
+      <w:r>
+        <w:t>": </w:t>
+      </w:r>
+      <w:r>
+        <w:rPr>
+          <w:b/>
+          <w:bCs/>
+        </w:rPr>
+        <w:t>true</w:t>
+      </w:r>
+      <w:r>
+        <w:t>,</w:t>
+      </w:r>
+    </w:p>
+    <w:p>
+      <w:r>
+        <w:t>        "permissions": [</w:t>
+      </w:r>
+    </w:p>
+    <w:p>
+      <w:r>
+        <w:t>            "</w:t>
+      </w:r>
+      <w:proofErr w:type="spellStart"/>
+      <w:proofErr w:type="gramStart"/>
+      <w:r>
+        <w:t>dashboard.self</w:t>
+      </w:r>
+      <w:proofErr w:type="gramEnd"/>
+      <w:r>
+        <w:t>.access</w:t>
+      </w:r>
+      <w:proofErr w:type="spellEnd"/>
+      <w:r>
+        <w:t>"</w:t>
+      </w:r>
+    </w:p>
+    <w:p>
+      <w:r>
+        <w:t>        ],</w:t>
+      </w:r>
+    </w:p>
+    <w:p>
+      <w:r>
+        <w:t>        "</w:t>
+      </w:r>
+      <w:proofErr w:type="spellStart"/>
+      <w:proofErr w:type="gramStart"/>
+      <w:r>
+        <w:t>role</w:t>
+      </w:r>
+      <w:proofErr w:type="gramEnd"/>
+      <w:r>
+        <w:t>_code</w:t>
+      </w:r>
+      <w:proofErr w:type="spellEnd"/>
+      <w:r>
+        <w:t>": "GENERAL_USER",</w:t>
+      </w:r>
+    </w:p>
+    <w:p>
+      <w:r>
+        <w:t>        "</w:t>
+      </w:r>
+      <w:proofErr w:type="spellStart"/>
+      <w:proofErr w:type="gramStart"/>
+      <w:r>
+        <w:t>role</w:t>
+      </w:r>
+      <w:proofErr w:type="gramEnd"/>
+      <w:r>
+        <w:t>_name</w:t>
+      </w:r>
+      <w:proofErr w:type="spellEnd"/>
+      <w:r>
+        <w:t>": "General User",</w:t>
+      </w:r>
+    </w:p>
+    <w:p>
+      <w:r>
+        <w:t>        "</w:t>
+      </w:r>
+      <w:proofErr w:type="spellStart"/>
+      <w:proofErr w:type="gramStart"/>
+      <w:r>
+        <w:t>user</w:t>
+      </w:r>
+      <w:proofErr w:type="gramEnd"/>
+      <w:r>
+        <w:t>_id</w:t>
+      </w:r>
+      <w:proofErr w:type="spellEnd"/>
+      <w:r>
+        <w:t>": 4,</w:t>
+      </w:r>
+    </w:p>
+    <w:p>
+      <w:r>
+        <w:t>        "</w:t>
+      </w:r>
+      <w:proofErr w:type="spellStart"/>
+      <w:proofErr w:type="gramStart"/>
+      <w:r>
+        <w:t>user</w:t>
+      </w:r>
+      <w:proofErr w:type="gramEnd"/>
+      <w:r>
+        <w:t>_type</w:t>
+      </w:r>
+      <w:proofErr w:type="spellEnd"/>
+      <w:r>
+        <w:t>": 3,</w:t>
+      </w:r>
+    </w:p>
+    <w:p>
+      <w:r>
+        <w:t>        "username": "</w:t>
+      </w:r>
+      <w:proofErr w:type="spellStart"/>
+      <w:proofErr w:type="gramStart"/>
+      <w:r>
+        <w:t>test.general</w:t>
+      </w:r>
+      <w:proofErr w:type="spellEnd"/>
+      <w:proofErr w:type="gramEnd"/>
+      <w:r>
+        <w:t>"</w:t>
+      </w:r>
+    </w:p>
+    <w:p>
+      <w:r>
+        <w:t>    },</w:t>
+      </w:r>
+    </w:p>
+    <w:p>
+      <w:r>
+        <w:t>    "success": </w:t>
+      </w:r>
+      <w:r>
+        <w:rPr>
+          <w:b/>
+          <w:bCs/>
+        </w:rPr>
+        <w:t>true</w:t>
+      </w:r>
+    </w:p>
+    <w:p>
+      <w:r>
+        <w:t>}</w:t>
+      </w:r>
+    </w:p>
+    <w:p/>
+    <w:p/>
+    <w:p/>
+    <w:p/>
+    <w:p/>
+    <w:p/>
+    <w:p>
+      <w:pPr>
+        <w:rPr>
+          <w:b/>
+          <w:bCs/>
+        </w:rPr>
+      </w:pPr>
+      <w:r>
+        <w:rPr>
+          <w:b/>
+          <w:bCs/>
+        </w:rPr>
+        <w:t>Postman</w:t>
+      </w:r>
+    </w:p>
+    <w:p>
+      <w:pPr>
+        <w:rPr>
+          <w:b/>
+          <w:bCs/>
+        </w:rPr>
+      </w:pPr>
+      <w:r>
+        <w:rPr>
+          <w:b/>
+          <w:bCs/>
+        </w:rPr>
+        <w:t>Step 7 — Test downstream summary again</w:t>
+      </w:r>
+    </w:p>
+    <w:p>
+      <w:r>
+        <w:t>Using that new token:</w:t>
+      </w:r>
+    </w:p>
+    <w:p>
+      <w:r>
+        <w:t>GET http://127.0.0.1:8080/api/v1/user/downstream-summary</w:t>
+      </w:r>
+    </w:p>
+    <w:p/>
+    <w:p>
+      <w:r>
+        <w:t>{</w:t>
+      </w:r>
+    </w:p>
+    <w:p>
+      <w:r>
+        <w:t>    "data</w:t>
+      </w:r>
+      <w:proofErr w:type="gramStart"/>
+      <w:r>
+        <w:t>": {</w:t>
+      </w:r>
+      <w:proofErr w:type="gramEnd"/>
+    </w:p>
+    <w:p>
+      <w:r>
+        <w:t>        "employees</w:t>
+      </w:r>
+      <w:proofErr w:type="gramStart"/>
+      <w:r>
+        <w:t>": {</w:t>
+      </w:r>
+      <w:proofErr w:type="gramEnd"/>
+    </w:p>
+    <w:p>
+      <w:r>
+        <w:t>            "</w:t>
+      </w:r>
+      <w:proofErr w:type="spellStart"/>
+      <w:proofErr w:type="gramStart"/>
+      <w:r>
+        <w:t>direct</w:t>
+      </w:r>
+      <w:proofErr w:type="gramEnd"/>
+      <w:r>
+        <w:t>_employees</w:t>
+      </w:r>
+      <w:proofErr w:type="spellEnd"/>
+      <w:r>
+        <w:t>": 37,</w:t>
+      </w:r>
+    </w:p>
+    <w:p>
+      <w:r>
+        <w:t>            "</w:t>
+      </w:r>
+      <w:proofErr w:type="spellStart"/>
+      <w:proofErr w:type="gramStart"/>
+      <w:r>
+        <w:t>all</w:t>
+      </w:r>
+      <w:proofErr w:type="gramEnd"/>
+      <w:r>
+        <w:t>_employees</w:t>
+      </w:r>
+      <w:proofErr w:type="spellEnd"/>
+      <w:r>
+        <w:t>": 2577</w:t>
+      </w:r>
+    </w:p>
+    <w:p>
+      <w:r>
+        <w:t>        },</w:t>
+      </w:r>
+    </w:p>
+    <w:p>
+      <w:r>
+        <w:t>        "devices</w:t>
+      </w:r>
+      <w:proofErr w:type="gramStart"/>
+      <w:r>
+        <w:t>": {</w:t>
+      </w:r>
+      <w:proofErr w:type="gramEnd"/>
+    </w:p>
+    <w:p>
+      <w:r>
+        <w:t>            "</w:t>
+      </w:r>
+      <w:proofErr w:type="spellStart"/>
+      <w:proofErr w:type="gramStart"/>
+      <w:r>
+        <w:t>assigned</w:t>
+      </w:r>
+      <w:proofErr w:type="gramEnd"/>
+      <w:r>
+        <w:t>_devices</w:t>
+      </w:r>
+      <w:proofErr w:type="spellEnd"/>
+      <w:r>
+        <w:t>": 2118</w:t>
+      </w:r>
+    </w:p>
+    <w:p>
+      <w:r>
+        <w:t>        },</w:t>
+      </w:r>
+    </w:p>
+    <w:p>
+      <w:r>
+        <w:t>        "tickets</w:t>
+      </w:r>
+      <w:proofErr w:type="gramStart"/>
+      <w:r>
+        <w:t>": {</w:t>
+      </w:r>
+      <w:proofErr w:type="gramEnd"/>
+    </w:p>
+    <w:p>
+      <w:r>
+        <w:t>            "total": 27561,</w:t>
+      </w:r>
+    </w:p>
+    <w:p>
+      <w:r>
+        <w:t>            "open": 0,</w:t>
+      </w:r>
+    </w:p>
+    <w:p>
+      <w:r>
+        <w:t>            "running": 115,</w:t>
+      </w:r>
+    </w:p>
+    <w:p>
+      <w:r>
+        <w:t>            "closed": 27446</w:t>
+      </w:r>
+    </w:p>
+    <w:p>
+      <w:r>
+        <w:t>        }</w:t>
+      </w:r>
+    </w:p>
+    <w:p>
+      <w:r>
+        <w:t>    },</w:t>
+      </w:r>
+    </w:p>
+    <w:p>
+      <w:r>
+        <w:t>    "success": </w:t>
+      </w:r>
+      <w:r>
+        <w:rPr>
+          <w:b/>
+          <w:bCs/>
+        </w:rPr>
+        <w:t>true</w:t>
+      </w:r>
+    </w:p>
+    <w:p>
+      <w:r>
+        <w:t>}</w:t>
+      </w:r>
+    </w:p>
+    <w:p/>
+    <w:p/>
+    <w:p/>
+    <w:p/>
+    <w:p>
+      <w:r>
+        <w:t xml:space="preserve">Postman in Dashboard </w:t>
+      </w:r>
+    </w:p>
+    <w:p/>
+    <w:p>
+      <w:proofErr w:type="gramStart"/>
+      <w:r>
+        <w:t>Method  GET</w:t>
+      </w:r>
+      <w:proofErr w:type="gramEnd"/>
+      <w:r>
+        <w:t xml:space="preserve"> : </w:t>
+      </w:r>
+      <w:r>
+        <w:t>http://127.0.0.1:8080/api/v1/user/dashboard</w:t>
+      </w:r>
+    </w:p>
+    <w:p>
+      <w:r>
+        <w:t>{</w:t>
+      </w:r>
+    </w:p>
+    <w:p>
+      <w:r>
+        <w:t>    "data</w:t>
+      </w:r>
+      <w:proofErr w:type="gramStart"/>
+      <w:r>
+        <w:t>": {</w:t>
+      </w:r>
+      <w:proofErr w:type="gramEnd"/>
+    </w:p>
+    <w:p>
+      <w:r>
+        <w:t>        "employee</w:t>
+      </w:r>
+      <w:proofErr w:type="gramStart"/>
+      <w:r>
+        <w:t>": {</w:t>
+      </w:r>
+      <w:proofErr w:type="gramEnd"/>
+    </w:p>
+    <w:p>
+      <w:r>
+        <w:t>            "</w:t>
+      </w:r>
+      <w:proofErr w:type="spellStart"/>
+      <w:proofErr w:type="gramStart"/>
+      <w:r>
+        <w:t>employee</w:t>
+      </w:r>
+      <w:proofErr w:type="gramEnd"/>
+      <w:r>
+        <w:t>_id</w:t>
+      </w:r>
+      <w:proofErr w:type="spellEnd"/>
+      <w:r>
+        <w:t>": "02-0003",</w:t>
+      </w:r>
+    </w:p>
+    <w:p>
+      <w:r>
+        <w:t>            "</w:t>
+      </w:r>
+      <w:proofErr w:type="gramStart"/>
+      <w:r>
+        <w:t>employee</w:t>
+      </w:r>
+      <w:proofErr w:type="gramEnd"/>
+      <w:r>
+        <w:t>_name": "Brig Gen Md. Rafiqur Rahman, psc (retd)",</w:t>
+      </w:r>
+    </w:p>
+    <w:p>
+      <w:r>
+        <w:t>            "designation": "Managing Director",</w:t>
+      </w:r>
+    </w:p>
+    <w:p>
+      <w:r>
+        <w:t>            "department": "MD Office",</w:t>
+      </w:r>
+    </w:p>
+    <w:p>
+      <w:r>
+        <w:t>            "</w:t>
+      </w:r>
+      <w:proofErr w:type="spellStart"/>
+      <w:proofErr w:type="gramStart"/>
+      <w:r>
+        <w:t>work</w:t>
+      </w:r>
+      <w:proofErr w:type="gramEnd"/>
+      <w:r>
+        <w:t>_field</w:t>
+      </w:r>
+      <w:proofErr w:type="spellEnd"/>
+      <w:r>
+        <w:t>": "",</w:t>
+      </w:r>
+    </w:p>
+    <w:p>
+      <w:r>
+        <w:t>            "</w:t>
+      </w:r>
+      <w:proofErr w:type="spellStart"/>
+      <w:proofErr w:type="gramStart"/>
+      <w:r>
+        <w:t>sub</w:t>
+      </w:r>
+      <w:proofErr w:type="gramEnd"/>
+      <w:r>
+        <w:t>_function</w:t>
+      </w:r>
+      <w:proofErr w:type="spellEnd"/>
+      <w:r>
+        <w:t>": "",</w:t>
+      </w:r>
+    </w:p>
+    <w:p>
+      <w:r>
+        <w:t>            "active": "Yes",</w:t>
+      </w:r>
+    </w:p>
+    <w:p>
+      <w:r>
+        <w:t>            "</w:t>
+      </w:r>
+      <w:proofErr w:type="spellStart"/>
+      <w:proofErr w:type="gramStart"/>
+      <w:r>
+        <w:t>personal</w:t>
+      </w:r>
+      <w:proofErr w:type="gramEnd"/>
+      <w:r>
+        <w:t>_cell</w:t>
+      </w:r>
+      <w:proofErr w:type="spellEnd"/>
+      <w:r>
+        <w:t>": "01552367708",</w:t>
+      </w:r>
+    </w:p>
+    <w:p>
+      <w:r>
+        <w:t>            "</w:t>
+      </w:r>
+      <w:proofErr w:type="spellStart"/>
+      <w:proofErr w:type="gramStart"/>
+      <w:r>
+        <w:t>official</w:t>
+      </w:r>
+      <w:proofErr w:type="gramEnd"/>
+      <w:r>
+        <w:t>_cell</w:t>
+      </w:r>
+      <w:proofErr w:type="spellEnd"/>
+      <w:r>
+        <w:t>": "01552367708",</w:t>
+      </w:r>
+    </w:p>
+    <w:p>
+      <w:r>
+        <w:t>            "email": "",</w:t>
+      </w:r>
+    </w:p>
+    <w:p>
+      <w:r>
+        <w:t>            "</w:t>
+      </w:r>
+      <w:proofErr w:type="spellStart"/>
+      <w:proofErr w:type="gramStart"/>
+      <w:r>
+        <w:t>official</w:t>
+      </w:r>
+      <w:proofErr w:type="gramEnd"/>
+      <w:r>
+        <w:t>_email</w:t>
+      </w:r>
+      <w:proofErr w:type="spellEnd"/>
+      <w:r>
+        <w:t>": "rafiqur.rahman@fiberathome.net",</w:t>
+      </w:r>
+    </w:p>
+    <w:p>
+      <w:r>
+        <w:t>            "picture": "</w:t>
+      </w:r>
+      <w:proofErr w:type="spellStart"/>
+      <w:r>
+        <w:t>user_images</w:t>
+      </w:r>
+      <w:proofErr w:type="spellEnd"/>
+      <w:r>
+        <w:t>/1640248534.jpg"</w:t>
+      </w:r>
+    </w:p>
+    <w:p>
+      <w:r>
+        <w:t>        },</w:t>
+      </w:r>
+    </w:p>
+    <w:p>
+      <w:r>
+        <w:t>        "tickets</w:t>
+      </w:r>
+      <w:proofErr w:type="gramStart"/>
+      <w:r>
+        <w:t>": {</w:t>
+      </w:r>
+      <w:proofErr w:type="gramEnd"/>
+    </w:p>
+    <w:p>
+      <w:r>
+        <w:t>            "total": 118,</w:t>
+      </w:r>
+    </w:p>
+    <w:p>
+      <w:r>
+        <w:t>            "open": 0,</w:t>
+      </w:r>
+    </w:p>
+    <w:p>
+      <w:r>
+        <w:t>            "running": 0,</w:t>
+      </w:r>
+    </w:p>
+    <w:p>
+      <w:r>
+        <w:t>            "closed": 118</w:t>
+      </w:r>
+    </w:p>
+    <w:p>
+      <w:r>
+        <w:lastRenderedPageBreak/>
+        <w:t>        }</w:t>
+      </w:r>
+    </w:p>
+    <w:p>
+      <w:r>
+        <w:t>    },</w:t>
+      </w:r>
+    </w:p>
+    <w:p>
+      <w:r>
+        <w:t>    "success": </w:t>
+      </w:r>
+      <w:r>
+        <w:rPr>
+          <w:b/>
+          <w:bCs/>
+        </w:rPr>
+        <w:t>true</w:t>
+      </w:r>
+    </w:p>
+    <w:p>
+      <w:r>
+        <w:t>}</w:t>
+      </w:r>
+    </w:p>
+    <w:p/>
+    <w:p/>
+    <w:p/>
+    <w:p>
+      <w:hyperlink r:id="rId15" w:history="1">
+        <w:r>
+          <w:rPr>
+            <w:rStyle w:val="Hyperlink"/>
+          </w:rPr>
+          <w:t>http://127.0.0.1:8080/api/v1/user/downstream-summary</w:t>
+        </w:r>
+      </w:hyperlink>
+    </w:p>
+    <w:p/>
+    <w:p>
+      <w:r>
+        <w:t>{</w:t>
+      </w:r>
+    </w:p>
+    <w:p>
+      <w:r>
+        <w:t>    "data</w:t>
+      </w:r>
+      <w:proofErr w:type="gramStart"/>
+      <w:r>
+        <w:t>": {</w:t>
+      </w:r>
+      <w:proofErr w:type="gramEnd"/>
+    </w:p>
+    <w:p>
+      <w:r>
+        <w:t>        "employees</w:t>
+      </w:r>
+      <w:proofErr w:type="gramStart"/>
+      <w:r>
+        <w:t>": {</w:t>
+      </w:r>
+      <w:proofErr w:type="gramEnd"/>
+    </w:p>
+    <w:p>
+      <w:r>
+        <w:t>            "</w:t>
+      </w:r>
+      <w:proofErr w:type="spellStart"/>
+      <w:proofErr w:type="gramStart"/>
+      <w:r>
+        <w:t>direct</w:t>
+      </w:r>
+      <w:proofErr w:type="gramEnd"/>
+      <w:r>
+        <w:t>_employees</w:t>
+      </w:r>
+      <w:proofErr w:type="spellEnd"/>
+      <w:r>
+        <w:t>": 37,</w:t>
+      </w:r>
+    </w:p>
+    <w:p>
+      <w:r>
+        <w:t>            "</w:t>
+      </w:r>
+      <w:proofErr w:type="spellStart"/>
+      <w:proofErr w:type="gramStart"/>
+      <w:r>
+        <w:t>all</w:t>
+      </w:r>
+      <w:proofErr w:type="gramEnd"/>
+      <w:r>
+        <w:t>_employees</w:t>
+      </w:r>
+      <w:proofErr w:type="spellEnd"/>
+      <w:r>
+        <w:t>": 2577</w:t>
+      </w:r>
+    </w:p>
+    <w:p>
+      <w:r>
+        <w:t>        },</w:t>
+      </w:r>
+    </w:p>
+    <w:p>
+      <w:r>
+        <w:t>        "devices</w:t>
+      </w:r>
+      <w:proofErr w:type="gramStart"/>
+      <w:r>
+        <w:t>": {</w:t>
+      </w:r>
+      <w:proofErr w:type="gramEnd"/>
+    </w:p>
+    <w:p>
+      <w:r>
+        <w:t>            "</w:t>
+      </w:r>
+      <w:proofErr w:type="spellStart"/>
+      <w:proofErr w:type="gramStart"/>
+      <w:r>
+        <w:t>assigned</w:t>
+      </w:r>
+      <w:proofErr w:type="gramEnd"/>
+      <w:r>
+        <w:t>_devices</w:t>
+      </w:r>
+      <w:proofErr w:type="spellEnd"/>
+      <w:r>
+        <w:t>": 2118</w:t>
+      </w:r>
+    </w:p>
+    <w:p>
+      <w:r>
+        <w:t>        },</w:t>
+      </w:r>
+    </w:p>
+    <w:p>
+      <w:r>
+        <w:t>        "tickets</w:t>
+      </w:r>
+      <w:proofErr w:type="gramStart"/>
+      <w:r>
+        <w:t>": {</w:t>
+      </w:r>
+      <w:proofErr w:type="gramEnd"/>
+    </w:p>
+    <w:p>
+      <w:r>
+        <w:t>            "total": 27561,</w:t>
+      </w:r>
+    </w:p>
+    <w:p>
+      <w:r>
+        <w:t>            "open": 0,</w:t>
+      </w:r>
+    </w:p>
+    <w:p>
+      <w:r>
+        <w:t>            "running": 115,</w:t>
+      </w:r>
+    </w:p>
+    <w:p>
+      <w:r>
+        <w:t>            "closed": 27446</w:t>
+      </w:r>
+    </w:p>
+    <w:p>
+      <w:r>
+        <w:t>        }</w:t>
+      </w:r>
+    </w:p>
+    <w:p>
+      <w:r>
+        <w:t>    },</w:t>
+      </w:r>
+    </w:p>
+    <w:p>
+      <w:r>
+        <w:t>    "success": </w:t>
+      </w:r>
+      <w:r>
+        <w:rPr>
+          <w:b/>
+          <w:bCs/>
+        </w:rPr>
+        <w:t>true</w:t>
+      </w:r>
+    </w:p>
+    <w:p>
+      <w:r>
+        <w:lastRenderedPageBreak/>
+        <w:t>}</w:t>
+      </w:r>
+    </w:p>
+    <w:p/>
+    <w:p/>
+    <w:p/>
+    <w:p>
+      <w:pPr>
+        <w:rPr>
+          <w:b/>
+          <w:bCs/>
+        </w:rPr>
+      </w:pPr>
+      <w:r>
+        <w:rPr>
+          <w:b/>
+          <w:bCs/>
+        </w:rPr>
+        <w:t>Now the design remains consistent:</w:t>
+      </w:r>
+    </w:p>
+    <w:p>
+      <w:pPr>
+        <w:rPr>
+          <w:color w:val="4472C4" w:themeColor="accent1"/>
+        </w:rPr>
+      </w:pPr>
+      <w:r>
+        <w:rPr>
+          <w:color w:val="4472C4" w:themeColor="accent1"/>
+        </w:rPr>
+        <w:t>GENERAL USER</w:t>
+      </w:r>
+    </w:p>
+    <w:p>
+      <w:pPr>
+        <w:rPr>
+          <w:color w:val="4472C4" w:themeColor="accent1"/>
+        </w:rPr>
+      </w:pPr>
+      <w:proofErr w:type="spellStart"/>
+      <w:r>
+        <w:rPr>
+          <w:color w:val="4472C4" w:themeColor="accent1"/>
+        </w:rPr>
+        <w:t>UserSidebar</w:t>
+      </w:r>
+      <w:proofErr w:type="spellEnd"/>
+      <w:r>
+        <w:rPr>
+          <w:color w:val="4472C4" w:themeColor="accent1"/>
+        </w:rPr>
+        <w:t xml:space="preserve"> | Employee Dashboard | </w:t>
+      </w:r>
+      <w:proofErr w:type="spellStart"/>
+      <w:r>
+        <w:rPr>
+          <w:color w:val="4472C4" w:themeColor="accent1"/>
+        </w:rPr>
+        <w:t>UserRightSidebar</w:t>
+      </w:r>
+      <w:proofErr w:type="spellEnd"/>
+    </w:p>
+    <w:p>
+      <w:pPr>
+        <w:rPr>
+          <w:color w:val="A20000"/>
+        </w:rPr>
+      </w:pPr>
+    </w:p>
+    <w:p>
+      <w:pPr>
+        <w:rPr>
+          <w:color w:val="A20000"/>
+        </w:rPr>
+      </w:pPr>
+      <w:r>
+        <w:rPr>
+          <w:color w:val="A20000"/>
+        </w:rPr>
+        <w:t>ADMIN / STAFF</w:t>
+      </w:r>
+    </w:p>
+    <w:p>
+      <w:pPr>
+        <w:rPr>
+          <w:color w:val="A20000"/>
+        </w:rPr>
+      </w:pPr>
+      <w:r>
+        <w:rPr>
+          <w:color w:val="A20000"/>
+        </w:rPr>
+        <w:t xml:space="preserve">Sidebar | Main Dashboard | </w:t>
+      </w:r>
+      <w:proofErr w:type="spellStart"/>
+      <w:r>
+        <w:rPr>
+          <w:color w:val="A20000"/>
+        </w:rPr>
+        <w:t>RightSidebar</w:t>
+      </w:r>
+      <w:proofErr w:type="spellEnd"/>
+    </w:p>
+    <w:p/>
+    <w:p>
+      <w:r>
+        <w:t>Run:</w:t>
+      </w:r>
+    </w:p>
+    <w:p>
+      <w:r>
+        <w:t>cd D:\ITM-Data\itm\frontend</w:t>
+      </w:r>
+    </w:p>
+    <w:p/>
+    <w:p>
+      <w:proofErr w:type="spellStart"/>
+      <w:r>
+        <w:t>npx</w:t>
+      </w:r>
+      <w:proofErr w:type="spellEnd"/>
+      <w:r>
+        <w:t xml:space="preserve"> </w:t>
+      </w:r>
+      <w:proofErr w:type="spellStart"/>
+      <w:r>
+        <w:t>tsc</w:t>
+      </w:r>
+      <w:proofErr w:type="spellEnd"/>
+      <w:r>
+        <w:t xml:space="preserve"> --</w:t>
+      </w:r>
+      <w:proofErr w:type="spellStart"/>
+      <w:r>
+        <w:t>noEmit</w:t>
+      </w:r>
+      <w:proofErr w:type="spellEnd"/>
+      <w:r>
+        <w:t xml:space="preserve"> 2&gt;&amp;1 |</w:t>
+      </w:r>
+    </w:p>
+    <w:p>
+      <w:r>
+        <w:t>Select-String "app/dashboard/</w:t>
+      </w:r>
+      <w:proofErr w:type="spellStart"/>
+      <w:r>
+        <w:t>layout.tsx|user-right-sidebar.tsx</w:t>
+      </w:r>
+      <w:proofErr w:type="spellEnd"/>
+      <w:r>
+        <w:t>"</w:t>
       </w:r>
     </w:p>
     <w:p/>

</xml_diff>

<commit_message>
To Add User Device List with Count Value
</commit_message>
<xml_diff>
--- a/document/Login as IT Personnel.docx
+++ b/document/Login as IT Personnel.docx
@@ -13,6 +13,19 @@
         </w:r>
       </w:hyperlink>
     </w:p>
+    <w:p/>
+    <w:p/>
+    <w:p>
+      <w:hyperlink r:id="rId5" w:history="1">
+        <w:r>
+          <w:rPr>
+            <w:rStyle w:val="Hyperlink"/>
+          </w:rPr>
+          <w:t>http://localhost:5173/dashboard/user</w:t>
+        </w:r>
+      </w:hyperlink>
+    </w:p>
+    <w:p/>
     <w:p/>
     <w:p>
       <w:r>
@@ -32,7 +45,7 @@
                     <pic:cNvPicPr/>
                   </pic:nvPicPr>
                   <pic:blipFill>
-                    <a:blip r:embed="rId5"/>
+                    <a:blip r:embed="rId6"/>
                     <a:stretch>
                       <a:fillRect/>
                     </a:stretch>
@@ -96,7 +109,6 @@
     <w:p/>
     <w:p>
       <w:r>
-        <w:lastRenderedPageBreak/>
         <w:drawing>
           <wp:inline distT="0" distB="0" distL="0" distR="0" wp14:anchorId="43044114" wp14:editId="135676D8">
             <wp:extent cx="5943600" cy="3174365"/>
@@ -113,7 +125,7 @@
                     <pic:cNvPicPr/>
                   </pic:nvPicPr>
                   <pic:blipFill>
-                    <a:blip r:embed="rId6"/>
+                    <a:blip r:embed="rId7"/>
                     <a:stretch>
                       <a:fillRect/>
                     </a:stretch>
@@ -157,15 +169,7 @@
     </w:p>
     <w:p>
       <w:r>
-        <w:t xml:space="preserve">    </w:t>
-      </w:r>
-      <w:proofErr w:type="gramStart"/>
-      <w:r>
-        <w:t>COUNT(</w:t>
-      </w:r>
-      <w:proofErr w:type="gramEnd"/>
-      <w:r>
-        <w:t xml:space="preserve">*) AS </w:t>
+        <w:t xml:space="preserve">    COUNT(*) AS </w:t>
       </w:r>
       <w:proofErr w:type="spellStart"/>
       <w:r>
@@ -180,23 +184,7 @@
     </w:p>
     <w:p>
       <w:r>
-        <w:t xml:space="preserve">    SELECT NULLIF(</w:t>
-      </w:r>
-      <w:proofErr w:type="gramStart"/>
-      <w:r>
-        <w:t>BTRIM(</w:t>
-      </w:r>
-      <w:proofErr w:type="gramEnd"/>
-      <w:r>
-        <w:t>tr1</w:t>
-      </w:r>
-      <w:proofErr w:type="gramStart"/>
-      <w:r>
-        <w:t>), '</w:t>
-      </w:r>
-      <w:proofErr w:type="gramEnd"/>
-      <w:r>
-        <w:t xml:space="preserve">') AS </w:t>
+        <w:t xml:space="preserve">    SELECT NULLIF(BTRIM(tr1), '') AS </w:t>
       </w:r>
       <w:proofErr w:type="spellStart"/>
       <w:r>
@@ -209,13 +197,8 @@
         <w:t xml:space="preserve">    FROM </w:t>
       </w:r>
       <w:proofErr w:type="spellStart"/>
-      <w:proofErr w:type="gramStart"/>
-      <w:r>
-        <w:t>public.employee</w:t>
-      </w:r>
-      <w:proofErr w:type="gramEnd"/>
-      <w:r>
-        <w:t>_tier</w:t>
+      <w:r>
+        <w:t>public.employee_tier</w:t>
       </w:r>
       <w:proofErr w:type="spellEnd"/>
     </w:p>
@@ -228,59 +211,30 @@
     <w:p/>
     <w:p>
       <w:r>
-        <w:t xml:space="preserve">    SELECT NULLIF(</w:t>
-      </w:r>
-      <w:proofErr w:type="gramStart"/>
-      <w:r>
-        <w:t>BTRIM(</w:t>
-      </w:r>
-      <w:proofErr w:type="gramEnd"/>
-      <w:r>
-        <w:t>tr2</w:t>
-      </w:r>
-      <w:proofErr w:type="gramStart"/>
-      <w:r>
-        <w:t>), '</w:t>
-      </w:r>
-      <w:proofErr w:type="gramEnd"/>
-      <w:r>
-        <w:t>')</w:t>
-      </w:r>
-    </w:p>
-    <w:p>
-      <w:r>
+        <w:t xml:space="preserve">    SELECT NULLIF(BTRIM(tr2), '')</w:t>
+      </w:r>
+    </w:p>
+    <w:p>
+      <w:r>
+        <w:lastRenderedPageBreak/>
         <w:t xml:space="preserve">    FROM </w:t>
       </w:r>
       <w:proofErr w:type="spellStart"/>
-      <w:proofErr w:type="gramStart"/>
-      <w:r>
-        <w:t>public.employee</w:t>
-      </w:r>
-      <w:proofErr w:type="gramEnd"/>
-      <w:r>
-        <w:t>_tier</w:t>
-      </w:r>
-      <w:proofErr w:type="spellEnd"/>
-    </w:p>
-    <w:p/>
-    <w:p>
-      <w:r>
-        <w:lastRenderedPageBreak/>
+      <w:r>
+        <w:t>public.employee_tier</w:t>
+      </w:r>
+      <w:proofErr w:type="spellEnd"/>
+    </w:p>
+    <w:p/>
+    <w:p>
+      <w:r>
         <w:t xml:space="preserve">    UNION ALL</w:t>
       </w:r>
     </w:p>
     <w:p/>
     <w:p>
       <w:r>
-        <w:t xml:space="preserve">    SELECT NULLIF(</w:t>
-      </w:r>
-      <w:proofErr w:type="gramStart"/>
-      <w:r>
-        <w:t>BTRIM(</w:t>
-      </w:r>
-      <w:proofErr w:type="gramEnd"/>
-      <w:r>
-        <w:t>tr3), '')</w:t>
+        <w:t xml:space="preserve">    SELECT NULLIF(BTRIM(tr3), '')</w:t>
       </w:r>
     </w:p>
     <w:p>
@@ -288,13 +242,8 @@
         <w:t xml:space="preserve">    FROM </w:t>
       </w:r>
       <w:proofErr w:type="spellStart"/>
-      <w:proofErr w:type="gramStart"/>
-      <w:r>
-        <w:t>public.employee</w:t>
-      </w:r>
-      <w:proofErr w:type="gramEnd"/>
-      <w:r>
-        <w:t>_tier</w:t>
+      <w:r>
+        <w:t>public.employee_tier</w:t>
       </w:r>
       <w:proofErr w:type="spellEnd"/>
     </w:p>
@@ -307,15 +256,7 @@
     <w:p/>
     <w:p>
       <w:r>
-        <w:t xml:space="preserve">    SELECT NULLIF(</w:t>
-      </w:r>
-      <w:proofErr w:type="gramStart"/>
-      <w:r>
-        <w:t>BTRIM(</w:t>
-      </w:r>
-      <w:proofErr w:type="gramEnd"/>
-      <w:r>
-        <w:t>tr4), '')</w:t>
+        <w:t xml:space="preserve">    SELECT NULLIF(BTRIM(tr4), '')</w:t>
       </w:r>
     </w:p>
     <w:p>
@@ -323,13 +264,8 @@
         <w:t xml:space="preserve">    FROM </w:t>
       </w:r>
       <w:proofErr w:type="spellStart"/>
-      <w:proofErr w:type="gramStart"/>
-      <w:r>
-        <w:t>public.employee</w:t>
-      </w:r>
-      <w:proofErr w:type="gramEnd"/>
-      <w:r>
-        <w:t>_tier</w:t>
+      <w:r>
+        <w:t>public.employee_tier</w:t>
       </w:r>
       <w:proofErr w:type="spellEnd"/>
     </w:p>
@@ -342,23 +278,7 @@
     <w:p/>
     <w:p>
       <w:r>
-        <w:t xml:space="preserve">    SELECT NULLIF(</w:t>
-      </w:r>
-      <w:proofErr w:type="gramStart"/>
-      <w:r>
-        <w:t>BTRIM(</w:t>
-      </w:r>
-      <w:proofErr w:type="gramEnd"/>
-      <w:r>
-        <w:t xml:space="preserve">tr5), </w:t>
-      </w:r>
-      <w:proofErr w:type="gramStart"/>
-      <w:r>
-        <w:t>''</w:t>
-      </w:r>
-      <w:proofErr w:type="gramEnd"/>
-      <w:r>
-        <w:t>)</w:t>
+        <w:t xml:space="preserve">    SELECT NULLIF(BTRIM(tr5), '')</w:t>
       </w:r>
     </w:p>
     <w:p>
@@ -366,13 +286,8 @@
         <w:t xml:space="preserve">    FROM </w:t>
       </w:r>
       <w:proofErr w:type="spellStart"/>
-      <w:proofErr w:type="gramStart"/>
-      <w:r>
-        <w:t>public.employee</w:t>
-      </w:r>
-      <w:proofErr w:type="gramEnd"/>
-      <w:r>
-        <w:t>_tier</w:t>
+      <w:r>
+        <w:t>public.employee_tier</w:t>
       </w:r>
       <w:proofErr w:type="spellEnd"/>
     </w:p>
@@ -385,23 +300,7 @@
     <w:p/>
     <w:p>
       <w:r>
-        <w:t xml:space="preserve">    SELECT NULLIF(</w:t>
-      </w:r>
-      <w:proofErr w:type="gramStart"/>
-      <w:r>
-        <w:t>BTRIM(</w:t>
-      </w:r>
-      <w:proofErr w:type="gramEnd"/>
-      <w:r>
-        <w:t>tr6</w:t>
-      </w:r>
-      <w:proofErr w:type="gramStart"/>
-      <w:r>
-        <w:t>), '</w:t>
-      </w:r>
-      <w:proofErr w:type="gramEnd"/>
-      <w:r>
-        <w:t>')</w:t>
+        <w:t xml:space="preserve">    SELECT NULLIF(BTRIM(tr6), '')</w:t>
       </w:r>
     </w:p>
     <w:p>
@@ -409,13 +308,8 @@
         <w:t xml:space="preserve">    FROM </w:t>
       </w:r>
       <w:proofErr w:type="spellStart"/>
-      <w:proofErr w:type="gramStart"/>
-      <w:r>
-        <w:t>public.employee</w:t>
-      </w:r>
-      <w:proofErr w:type="gramEnd"/>
-      <w:r>
-        <w:t>_tier</w:t>
+      <w:r>
+        <w:t>public.employee_tier</w:t>
       </w:r>
       <w:proofErr w:type="spellEnd"/>
     </w:p>
@@ -468,7 +362,6 @@
     <w:p/>
     <w:p>
       <w:r>
-        <w:lastRenderedPageBreak/>
         <w:drawing>
           <wp:inline distT="0" distB="0" distL="0" distR="0" wp14:anchorId="53ECE861" wp14:editId="6E9198D6">
             <wp:extent cx="5943600" cy="3105150"/>
@@ -485,7 +378,7 @@
                     <pic:cNvPicPr/>
                   </pic:nvPicPr>
                   <pic:blipFill>
-                    <a:blip r:embed="rId7"/>
+                    <a:blip r:embed="rId8"/>
                     <a:stretch>
                       <a:fillRect/>
                     </a:stretch>
@@ -524,24 +417,11 @@
     </w:p>
     <w:p>
       <w:r>
-        <w:t xml:space="preserve">    </w:t>
-      </w:r>
-      <w:proofErr w:type="gramStart"/>
-      <w:r>
-        <w:t>COUNT(</w:t>
-      </w:r>
-      <w:proofErr w:type="gramEnd"/>
-      <w:r>
-        <w:t xml:space="preserve">DISTINCT </w:t>
-      </w:r>
-      <w:proofErr w:type="spellStart"/>
-      <w:proofErr w:type="gramStart"/>
-      <w:r>
-        <w:t>et.employee</w:t>
-      </w:r>
-      <w:proofErr w:type="gramEnd"/>
-      <w:r>
-        <w:t>_id</w:t>
+        <w:t xml:space="preserve">    COUNT(DISTINCT </w:t>
+      </w:r>
+      <w:proofErr w:type="spellStart"/>
+      <w:r>
+        <w:t>et.employee_id</w:t>
       </w:r>
       <w:proofErr w:type="spellEnd"/>
       <w:r>
@@ -559,41 +439,23 @@
     <w:p/>
     <w:p>
       <w:r>
-        <w:t xml:space="preserve">    </w:t>
-      </w:r>
-      <w:proofErr w:type="gramStart"/>
-      <w:r>
-        <w:t>COUNT(</w:t>
-      </w:r>
-      <w:proofErr w:type="gramEnd"/>
-    </w:p>
-    <w:p>
-      <w:r>
+        <w:t xml:space="preserve">    COUNT(</w:t>
+      </w:r>
+    </w:p>
+    <w:p>
+      <w:r>
+        <w:lastRenderedPageBreak/>
         <w:t xml:space="preserve">        DISTINCT CASE</w:t>
       </w:r>
     </w:p>
     <w:p>
       <w:r>
-        <w:lastRenderedPageBreak/>
-        <w:t xml:space="preserve">            WHEN </w:t>
-      </w:r>
-      <w:proofErr w:type="gramStart"/>
-      <w:r>
-        <w:t>BTRIM(</w:t>
-      </w:r>
-      <w:proofErr w:type="gramEnd"/>
-    </w:p>
-    <w:p>
-      <w:r>
-        <w:t xml:space="preserve">                </w:t>
-      </w:r>
-      <w:proofErr w:type="gramStart"/>
-      <w:r>
-        <w:t>COALESCE(</w:t>
-      </w:r>
-      <w:proofErr w:type="gramEnd"/>
-      <w:r>
-        <w:t>et.tr1, '')</w:t>
+        <w:t xml:space="preserve">            WHEN BTRIM(</w:t>
+      </w:r>
+    </w:p>
+    <w:p>
+      <w:r>
+        <w:t xml:space="preserve">                COALESCE(et.tr1, '')</w:t>
       </w:r>
     </w:p>
     <w:p>
@@ -606,13 +468,8 @@
         <w:t xml:space="preserve">            THEN </w:t>
       </w:r>
       <w:proofErr w:type="spellStart"/>
-      <w:proofErr w:type="gramStart"/>
-      <w:r>
-        <w:t>et.employee</w:t>
-      </w:r>
-      <w:proofErr w:type="gramEnd"/>
-      <w:r>
-        <w:t>_id</w:t>
+      <w:r>
+        <w:t>et.employee_id</w:t>
       </w:r>
       <w:proofErr w:type="spellEnd"/>
     </w:p>
@@ -637,13 +494,8 @@
         <w:t xml:space="preserve">FROM </w:t>
       </w:r>
       <w:proofErr w:type="spellStart"/>
-      <w:proofErr w:type="gramStart"/>
-      <w:r>
-        <w:t>public.employee</w:t>
-      </w:r>
-      <w:proofErr w:type="gramEnd"/>
-      <w:r>
-        <w:t>_tier</w:t>
+      <w:r>
+        <w:t>public.employee_tier</w:t>
       </w:r>
       <w:proofErr w:type="spellEnd"/>
       <w:r>
@@ -652,88 +504,38 @@
     </w:p>
     <w:p/>
     <w:p>
-      <w:proofErr w:type="gramStart"/>
       <w:r>
         <w:t>WHERE</w:t>
       </w:r>
-      <w:proofErr w:type="gramEnd"/>
-    </w:p>
-    <w:p>
-      <w:r>
-        <w:t xml:space="preserve">       </w:t>
-      </w:r>
-      <w:proofErr w:type="gramStart"/>
-      <w:r>
-        <w:t>BTRIM(COALESCE(et.tr1, '</w:t>
-      </w:r>
-      <w:proofErr w:type="gramEnd"/>
-      <w:r>
-        <w:t>')) = '02-0003'</w:t>
-      </w:r>
-    </w:p>
-    <w:p>
-      <w:r>
-        <w:t xml:space="preserve">    OR </w:t>
-      </w:r>
-      <w:proofErr w:type="gramStart"/>
-      <w:r>
-        <w:t>BTRIM(COALESCE(et.tr2, '</w:t>
-      </w:r>
-      <w:proofErr w:type="gramEnd"/>
-      <w:r>
-        <w:t>')) = '02-0003'</w:t>
-      </w:r>
-    </w:p>
-    <w:p>
-      <w:r>
-        <w:t xml:space="preserve">    OR </w:t>
-      </w:r>
-      <w:proofErr w:type="gramStart"/>
-      <w:r>
-        <w:t>BTRIM(COALESCE(et.tr3, '</w:t>
-      </w:r>
-      <w:proofErr w:type="gramEnd"/>
-      <w:r>
-        <w:t>')) = '02-0003'</w:t>
-      </w:r>
-    </w:p>
-    <w:p>
-      <w:r>
-        <w:t xml:space="preserve">    OR </w:t>
-      </w:r>
-      <w:proofErr w:type="gramStart"/>
-      <w:r>
-        <w:t>BTRIM(COALESCE(</w:t>
-      </w:r>
-      <w:proofErr w:type="gramEnd"/>
-      <w:r>
-        <w:t>et.tr4, '')) = '02-0003'</w:t>
-      </w:r>
-    </w:p>
-    <w:p>
-      <w:r>
-        <w:t xml:space="preserve">    OR </w:t>
-      </w:r>
-      <w:proofErr w:type="gramStart"/>
-      <w:r>
-        <w:t>BTRIM(COALESCE(</w:t>
-      </w:r>
-      <w:proofErr w:type="gramEnd"/>
-      <w:r>
-        <w:t>et.tr5, '')) = '02-0003'</w:t>
-      </w:r>
-    </w:p>
-    <w:p>
-      <w:r>
-        <w:t xml:space="preserve">    OR </w:t>
-      </w:r>
-      <w:proofErr w:type="gramStart"/>
-      <w:r>
-        <w:t>BTRIM(COALESCE(</w:t>
-      </w:r>
-      <w:proofErr w:type="gramEnd"/>
-      <w:r>
-        <w:t>et.tr6, '')) = '02-0003';</w:t>
+    </w:p>
+    <w:p>
+      <w:r>
+        <w:t xml:space="preserve">       BTRIM(COALESCE(et.tr1, '')) = '02-0003'</w:t>
+      </w:r>
+    </w:p>
+    <w:p>
+      <w:r>
+        <w:t xml:space="preserve">    OR BTRIM(COALESCE(et.tr2, '')) = '02-0003'</w:t>
+      </w:r>
+    </w:p>
+    <w:p>
+      <w:r>
+        <w:t xml:space="preserve">    OR BTRIM(COALESCE(et.tr3, '')) = '02-0003'</w:t>
+      </w:r>
+    </w:p>
+    <w:p>
+      <w:r>
+        <w:t xml:space="preserve">    OR BTRIM(COALESCE(et.tr4, '')) = '02-0003'</w:t>
+      </w:r>
+    </w:p>
+    <w:p>
+      <w:r>
+        <w:t xml:space="preserve">    OR BTRIM(COALESCE(et.tr5, '')) = '02-0003'</w:t>
+      </w:r>
+    </w:p>
+    <w:p>
+      <w:r>
+        <w:t xml:space="preserve">    OR BTRIM(COALESCE(et.tr6, '')) = '02-0003';</w:t>
       </w:r>
     </w:p>
     <w:p/>
@@ -757,7 +559,7 @@
                     <pic:cNvPicPr/>
                   </pic:nvPicPr>
                   <pic:blipFill>
-                    <a:blip r:embed="rId8"/>
+                    <a:blip r:embed="rId9"/>
                     <a:stretch>
                       <a:fillRect/>
                     </a:stretch>
@@ -802,13 +604,8 @@
       </w:r>
     </w:p>
     <w:p>
-      <w:proofErr w:type="gramStart"/>
-      <w:r>
-        <w:t>Method :</w:t>
-      </w:r>
-      <w:proofErr w:type="gramEnd"/>
-      <w:r>
-        <w:t xml:space="preserve"> Get</w:t>
+      <w:r>
+        <w:t>Method : Get</w:t>
       </w:r>
     </w:p>
     <w:p>
@@ -834,7 +631,7 @@
                     <pic:cNvPicPr/>
                   </pic:nvPicPr>
                   <pic:blipFill>
-                    <a:blip r:embed="rId9"/>
+                    <a:blip r:embed="rId10"/>
                     <a:stretch>
                       <a:fillRect/>
                     </a:stretch>
@@ -859,7 +656,7 @@
     <w:p/>
     <w:p/>
     <w:p>
-      <w:hyperlink r:id="rId10" w:history="1">
+      <w:hyperlink r:id="rId11" w:history="1">
         <w:r>
           <w:rPr>
             <w:rStyle w:val="Hyperlink"/>
@@ -887,7 +684,7 @@
                     <pic:cNvPicPr/>
                   </pic:nvPicPr>
                   <pic:blipFill>
-                    <a:blip r:embed="rId11"/>
+                    <a:blip r:embed="rId12"/>
                     <a:stretch>
                       <a:fillRect/>
                     </a:stretch>
@@ -913,7 +710,7 @@
       <w:r>
         <w:t xml:space="preserve">GET </w:t>
       </w:r>
-      <w:hyperlink r:id="rId12" w:history="1">
+      <w:hyperlink r:id="rId13" w:history="1">
         <w:r>
           <w:rPr>
             <w:rStyle w:val="Hyperlink"/>
@@ -930,26 +727,16 @@
     </w:p>
     <w:p>
       <w:r>
-        <w:t>    "data</w:t>
-      </w:r>
-      <w:proofErr w:type="gramStart"/>
-      <w:r>
-        <w:t>": {</w:t>
-      </w:r>
-      <w:proofErr w:type="gramEnd"/>
+        <w:t>    "data": {</w:t>
+      </w:r>
     </w:p>
     <w:p>
       <w:r>
         <w:t>        "</w:t>
       </w:r>
       <w:proofErr w:type="spellStart"/>
-      <w:proofErr w:type="gramStart"/>
-      <w:r>
-        <w:t>account</w:t>
-      </w:r>
-      <w:proofErr w:type="gramEnd"/>
-      <w:r>
-        <w:t>_status</w:t>
+      <w:r>
+        <w:t>account_status</w:t>
       </w:r>
       <w:proofErr w:type="spellEnd"/>
       <w:r>
@@ -974,13 +761,8 @@
         <w:t>        "</w:t>
       </w:r>
       <w:proofErr w:type="spellStart"/>
-      <w:proofErr w:type="gramStart"/>
-      <w:r>
-        <w:t>employee</w:t>
-      </w:r>
-      <w:proofErr w:type="gramEnd"/>
-      <w:r>
-        <w:t>_id</w:t>
+      <w:r>
+        <w:t>employee_id</w:t>
       </w:r>
       <w:proofErr w:type="spellEnd"/>
       <w:r>
@@ -992,13 +774,8 @@
         <w:t>        "</w:t>
       </w:r>
       <w:proofErr w:type="spellStart"/>
-      <w:proofErr w:type="gramStart"/>
-      <w:r>
-        <w:t>full</w:t>
-      </w:r>
-      <w:proofErr w:type="gramEnd"/>
-      <w:r>
-        <w:t>_name</w:t>
+      <w:r>
+        <w:t>full_name</w:t>
       </w:r>
       <w:proofErr w:type="spellEnd"/>
       <w:r>
@@ -1010,13 +787,8 @@
         <w:t>        "</w:t>
       </w:r>
       <w:proofErr w:type="spellStart"/>
-      <w:proofErr w:type="gramStart"/>
-      <w:r>
-        <w:t>must</w:t>
-      </w:r>
-      <w:proofErr w:type="gramEnd"/>
-      <w:r>
-        <w:t>_change_password</w:t>
+      <w:r>
+        <w:t>must_change_password</w:t>
       </w:r>
       <w:proofErr w:type="spellEnd"/>
       <w:r>
@@ -1044,13 +816,8 @@
         <w:t>            "</w:t>
       </w:r>
       <w:proofErr w:type="spellStart"/>
-      <w:proofErr w:type="gramStart"/>
-      <w:r>
-        <w:t>dashboard.self</w:t>
-      </w:r>
-      <w:proofErr w:type="gramEnd"/>
-      <w:r>
-        <w:t>.access</w:t>
+      <w:r>
+        <w:t>dashboard.self.access</w:t>
       </w:r>
       <w:proofErr w:type="spellEnd"/>
       <w:r>
@@ -1067,13 +834,8 @@
         <w:t>        "</w:t>
       </w:r>
       <w:proofErr w:type="spellStart"/>
-      <w:proofErr w:type="gramStart"/>
-      <w:r>
-        <w:t>role</w:t>
-      </w:r>
-      <w:proofErr w:type="gramEnd"/>
-      <w:r>
-        <w:t>_code</w:t>
+      <w:r>
+        <w:t>role_code</w:t>
       </w:r>
       <w:proofErr w:type="spellEnd"/>
       <w:r>
@@ -1085,13 +847,8 @@
         <w:t>        "</w:t>
       </w:r>
       <w:proofErr w:type="spellStart"/>
-      <w:proofErr w:type="gramStart"/>
-      <w:r>
-        <w:t>role</w:t>
-      </w:r>
-      <w:proofErr w:type="gramEnd"/>
-      <w:r>
-        <w:t>_name</w:t>
+      <w:r>
+        <w:t>role_name</w:t>
       </w:r>
       <w:proofErr w:type="spellEnd"/>
       <w:r>
@@ -1103,13 +860,8 @@
         <w:t>        "</w:t>
       </w:r>
       <w:proofErr w:type="spellStart"/>
-      <w:proofErr w:type="gramStart"/>
-      <w:r>
-        <w:t>user</w:t>
-      </w:r>
-      <w:proofErr w:type="gramEnd"/>
-      <w:r>
-        <w:t>_id</w:t>
+      <w:r>
+        <w:t>user_id</w:t>
       </w:r>
       <w:proofErr w:type="spellEnd"/>
       <w:r>
@@ -1121,13 +873,8 @@
         <w:t>        "</w:t>
       </w:r>
       <w:proofErr w:type="spellStart"/>
-      <w:proofErr w:type="gramStart"/>
-      <w:r>
-        <w:t>user</w:t>
-      </w:r>
-      <w:proofErr w:type="gramEnd"/>
-      <w:r>
-        <w:t>_type</w:t>
+      <w:r>
+        <w:t>user_type</w:t>
       </w:r>
       <w:proofErr w:type="spellEnd"/>
       <w:r>
@@ -1139,12 +886,10 @@
         <w:t>        "username": "</w:t>
       </w:r>
       <w:proofErr w:type="spellStart"/>
-      <w:proofErr w:type="gramStart"/>
       <w:r>
         <w:t>test.general</w:t>
       </w:r>
       <w:proofErr w:type="spellEnd"/>
-      <w:proofErr w:type="gramEnd"/>
       <w:r>
         <w:t>"</w:t>
       </w:r>
@@ -1180,13 +925,8 @@
     </w:p>
     <w:p>
       <w:r>
-        <w:t xml:space="preserve">    </w:t>
-      </w:r>
-      <w:proofErr w:type="gramStart"/>
-      <w:r>
-        <w:t>COUNT(</w:t>
-      </w:r>
-      <w:proofErr w:type="gramEnd"/>
+        <w:t xml:space="preserve">    COUNT(</w:t>
+      </w:r>
     </w:p>
     <w:p>
       <w:r>
@@ -1195,32 +935,16 @@
     </w:p>
     <w:p>
       <w:r>
-        <w:t xml:space="preserve">            WHEN </w:t>
-      </w:r>
-      <w:proofErr w:type="gramStart"/>
-      <w:r>
-        <w:t>BTRIM(COALESCE(</w:t>
-      </w:r>
-      <w:proofErr w:type="gramEnd"/>
-      <w:r>
-        <w:t>et.tr1, '')) = '02-0003'</w:t>
-      </w:r>
-    </w:p>
-    <w:p>
-      <w:r>
-        <w:t xml:space="preserve">            THEN </w:t>
-      </w:r>
-      <w:proofErr w:type="gramStart"/>
-      <w:r>
-        <w:t>BTRIM(</w:t>
-      </w:r>
-      <w:proofErr w:type="spellStart"/>
-      <w:r>
-        <w:t>et.employee</w:t>
-      </w:r>
-      <w:proofErr w:type="gramEnd"/>
-      <w:r>
-        <w:t>_id</w:t>
+        <w:t xml:space="preserve">            WHEN BTRIM(COALESCE(et.tr1, '')) = '02-0003'</w:t>
+      </w:r>
+    </w:p>
+    <w:p>
+      <w:r>
+        <w:t xml:space="preserve">            THEN BTRIM(</w:t>
+      </w:r>
+      <w:proofErr w:type="spellStart"/>
+      <w:r>
+        <w:t>et.employee_id</w:t>
       </w:r>
       <w:proofErr w:type="spellEnd"/>
       <w:r>
@@ -1248,29 +972,16 @@
     <w:p/>
     <w:p>
       <w:r>
-        <w:t xml:space="preserve">    </w:t>
-      </w:r>
-      <w:proofErr w:type="gramStart"/>
-      <w:r>
-        <w:t>COUNT(</w:t>
-      </w:r>
-      <w:proofErr w:type="gramEnd"/>
-    </w:p>
-    <w:p>
-      <w:r>
-        <w:t xml:space="preserve">        DISTINCT </w:t>
-      </w:r>
-      <w:proofErr w:type="gramStart"/>
-      <w:r>
-        <w:t>BTRIM(</w:t>
-      </w:r>
-      <w:proofErr w:type="spellStart"/>
-      <w:r>
-        <w:t>et.employee</w:t>
-      </w:r>
-      <w:proofErr w:type="gramEnd"/>
-      <w:r>
-        <w:t>_id</w:t>
+        <w:t xml:space="preserve">    COUNT(</w:t>
+      </w:r>
+    </w:p>
+    <w:p>
+      <w:r>
+        <w:t xml:space="preserve">        DISTINCT BTRIM(</w:t>
+      </w:r>
+      <w:proofErr w:type="spellStart"/>
+      <w:r>
+        <w:t>et.employee_id</w:t>
       </w:r>
       <w:proofErr w:type="spellEnd"/>
       <w:r>
@@ -1293,13 +1004,8 @@
         <w:t xml:space="preserve">FROM </w:t>
       </w:r>
       <w:proofErr w:type="spellStart"/>
-      <w:proofErr w:type="gramStart"/>
-      <w:r>
-        <w:t>public.employee</w:t>
-      </w:r>
-      <w:proofErr w:type="gramEnd"/>
-      <w:r>
-        <w:t>_tier</w:t>
+      <w:r>
+        <w:t>public.employee_tier</w:t>
       </w:r>
       <w:proofErr w:type="spellEnd"/>
       <w:r>
@@ -1308,89 +1014,39 @@
     </w:p>
     <w:p/>
     <w:p>
-      <w:proofErr w:type="gramStart"/>
       <w:r>
         <w:lastRenderedPageBreak/>
         <w:t>WHERE</w:t>
       </w:r>
-      <w:proofErr w:type="gramEnd"/>
-    </w:p>
-    <w:p>
-      <w:r>
-        <w:t xml:space="preserve">       </w:t>
-      </w:r>
-      <w:proofErr w:type="gramStart"/>
-      <w:r>
-        <w:t>BTRIM(COALESCE(et.tr1, '</w:t>
-      </w:r>
-      <w:proofErr w:type="gramEnd"/>
-      <w:r>
-        <w:t>')) = '02-0003'</w:t>
-      </w:r>
-    </w:p>
-    <w:p>
-      <w:r>
-        <w:t xml:space="preserve">    OR </w:t>
-      </w:r>
-      <w:proofErr w:type="gramStart"/>
-      <w:r>
-        <w:t>BTRIM(COALESCE(et.tr2, '</w:t>
-      </w:r>
-      <w:proofErr w:type="gramEnd"/>
-      <w:r>
-        <w:t>')) = '02-0003'</w:t>
-      </w:r>
-    </w:p>
-    <w:p>
-      <w:r>
-        <w:t xml:space="preserve">    OR </w:t>
-      </w:r>
-      <w:proofErr w:type="gramStart"/>
-      <w:r>
-        <w:t>BTRIM(COALESCE(et.tr3, '</w:t>
-      </w:r>
-      <w:proofErr w:type="gramEnd"/>
-      <w:r>
-        <w:t>')) = '02-0003'</w:t>
-      </w:r>
-    </w:p>
-    <w:p>
-      <w:r>
-        <w:t xml:space="preserve">    OR </w:t>
-      </w:r>
-      <w:proofErr w:type="gramStart"/>
-      <w:r>
-        <w:t>BTRIM(COALESCE(</w:t>
-      </w:r>
-      <w:proofErr w:type="gramEnd"/>
-      <w:r>
-        <w:t>et.tr4, '')) = '02-0003'</w:t>
-      </w:r>
-    </w:p>
-    <w:p>
-      <w:r>
-        <w:t xml:space="preserve">    OR </w:t>
-      </w:r>
-      <w:proofErr w:type="gramStart"/>
-      <w:r>
-        <w:t>BTRIM(COALESCE(</w:t>
-      </w:r>
-      <w:proofErr w:type="gramEnd"/>
-      <w:r>
-        <w:t>et.tr5, '')) = '02-0003'</w:t>
-      </w:r>
-    </w:p>
-    <w:p>
-      <w:r>
-        <w:t xml:space="preserve">    OR </w:t>
-      </w:r>
-      <w:proofErr w:type="gramStart"/>
-      <w:r>
-        <w:t>BTRIM(COALESCE(</w:t>
-      </w:r>
-      <w:proofErr w:type="gramEnd"/>
-      <w:r>
-        <w:t>et.tr6, '')) = '02-0003';</w:t>
+    </w:p>
+    <w:p>
+      <w:r>
+        <w:t xml:space="preserve">       BTRIM(COALESCE(et.tr1, '')) = '02-0003'</w:t>
+      </w:r>
+    </w:p>
+    <w:p>
+      <w:r>
+        <w:t xml:space="preserve">    OR BTRIM(COALESCE(et.tr2, '')) = '02-0003'</w:t>
+      </w:r>
+    </w:p>
+    <w:p>
+      <w:r>
+        <w:t xml:space="preserve">    OR BTRIM(COALESCE(et.tr3, '')) = '02-0003'</w:t>
+      </w:r>
+    </w:p>
+    <w:p>
+      <w:r>
+        <w:t xml:space="preserve">    OR BTRIM(COALESCE(et.tr4, '')) = '02-0003'</w:t>
+      </w:r>
+    </w:p>
+    <w:p>
+      <w:r>
+        <w:t xml:space="preserve">    OR BTRIM(COALESCE(et.tr5, '')) = '02-0003'</w:t>
+      </w:r>
+    </w:p>
+    <w:p>
+      <w:r>
+        <w:t xml:space="preserve">    OR BTRIM(COALESCE(et.tr6, '')) = '02-0003';</w:t>
       </w:r>
     </w:p>
     <w:p/>
@@ -1412,7 +1068,7 @@
                     <pic:cNvPicPr/>
                   </pic:nvPicPr>
                   <pic:blipFill>
-                    <a:blip r:embed="rId13"/>
+                    <a:blip r:embed="rId14"/>
                     <a:stretch>
                       <a:fillRect/>
                     </a:stretch>
@@ -1458,7 +1114,7 @@
     </w:p>
     <w:p/>
     <w:p>
-      <w:hyperlink r:id="rId14" w:history="1">
+      <w:hyperlink r:id="rId15" w:history="1">
         <w:r>
           <w:rPr>
             <w:rStyle w:val="Hyperlink"/>
@@ -1474,26 +1130,16 @@
     </w:p>
     <w:p>
       <w:r>
-        <w:t>    "data</w:t>
-      </w:r>
-      <w:proofErr w:type="gramStart"/>
-      <w:r>
-        <w:t>": {</w:t>
-      </w:r>
-      <w:proofErr w:type="gramEnd"/>
+        <w:t>    "data": {</w:t>
+      </w:r>
     </w:p>
     <w:p>
       <w:r>
         <w:t>        "</w:t>
       </w:r>
       <w:proofErr w:type="spellStart"/>
-      <w:proofErr w:type="gramStart"/>
-      <w:r>
-        <w:t>account</w:t>
-      </w:r>
-      <w:proofErr w:type="gramEnd"/>
-      <w:r>
-        <w:t>_status</w:t>
+      <w:r>
+        <w:t>account_status</w:t>
       </w:r>
       <w:proofErr w:type="spellEnd"/>
       <w:r>
@@ -1518,13 +1164,8 @@
         <w:t>        "</w:t>
       </w:r>
       <w:proofErr w:type="spellStart"/>
-      <w:proofErr w:type="gramStart"/>
-      <w:r>
-        <w:t>employee</w:t>
-      </w:r>
-      <w:proofErr w:type="gramEnd"/>
-      <w:r>
-        <w:t>_id</w:t>
+      <w:r>
+        <w:t>employee_id</w:t>
       </w:r>
       <w:proofErr w:type="spellEnd"/>
       <w:r>
@@ -1536,13 +1177,8 @@
         <w:t>        "</w:t>
       </w:r>
       <w:proofErr w:type="spellStart"/>
-      <w:proofErr w:type="gramStart"/>
-      <w:r>
-        <w:t>full</w:t>
-      </w:r>
-      <w:proofErr w:type="gramEnd"/>
-      <w:r>
-        <w:t>_name</w:t>
+      <w:r>
+        <w:t>full_name</w:t>
       </w:r>
       <w:proofErr w:type="spellEnd"/>
       <w:r>
@@ -1554,13 +1190,8 @@
         <w:t>        "</w:t>
       </w:r>
       <w:proofErr w:type="spellStart"/>
-      <w:proofErr w:type="gramStart"/>
-      <w:r>
-        <w:t>must</w:t>
-      </w:r>
-      <w:proofErr w:type="gramEnd"/>
-      <w:r>
-        <w:t>_change_password</w:t>
+      <w:r>
+        <w:t>must_change_password</w:t>
       </w:r>
       <w:proofErr w:type="spellEnd"/>
       <w:r>
@@ -1587,13 +1218,8 @@
         <w:t>            "</w:t>
       </w:r>
       <w:proofErr w:type="spellStart"/>
-      <w:proofErr w:type="gramStart"/>
-      <w:r>
-        <w:t>dashboard.self</w:t>
-      </w:r>
-      <w:proofErr w:type="gramEnd"/>
-      <w:r>
-        <w:t>.access</w:t>
+      <w:r>
+        <w:t>dashboard.self.access</w:t>
       </w:r>
       <w:proofErr w:type="spellEnd"/>
       <w:r>
@@ -1610,13 +1236,8 @@
         <w:t>        "</w:t>
       </w:r>
       <w:proofErr w:type="spellStart"/>
-      <w:proofErr w:type="gramStart"/>
-      <w:r>
-        <w:t>role</w:t>
-      </w:r>
-      <w:proofErr w:type="gramEnd"/>
-      <w:r>
-        <w:t>_code</w:t>
+      <w:r>
+        <w:t>role_code</w:t>
       </w:r>
       <w:proofErr w:type="spellEnd"/>
       <w:r>
@@ -1628,13 +1249,8 @@
         <w:t>        "</w:t>
       </w:r>
       <w:proofErr w:type="spellStart"/>
-      <w:proofErr w:type="gramStart"/>
-      <w:r>
-        <w:t>role</w:t>
-      </w:r>
-      <w:proofErr w:type="gramEnd"/>
-      <w:r>
-        <w:t>_name</w:t>
+      <w:r>
+        <w:t>role_name</w:t>
       </w:r>
       <w:proofErr w:type="spellEnd"/>
       <w:r>
@@ -1646,13 +1262,8 @@
         <w:t>        "</w:t>
       </w:r>
       <w:proofErr w:type="spellStart"/>
-      <w:proofErr w:type="gramStart"/>
-      <w:r>
-        <w:t>user</w:t>
-      </w:r>
-      <w:proofErr w:type="gramEnd"/>
-      <w:r>
-        <w:t>_id</w:t>
+      <w:r>
+        <w:t>user_id</w:t>
       </w:r>
       <w:proofErr w:type="spellEnd"/>
       <w:r>
@@ -1664,13 +1275,8 @@
         <w:t>        "</w:t>
       </w:r>
       <w:proofErr w:type="spellStart"/>
-      <w:proofErr w:type="gramStart"/>
-      <w:r>
-        <w:t>user</w:t>
-      </w:r>
-      <w:proofErr w:type="gramEnd"/>
-      <w:r>
-        <w:t>_type</w:t>
+      <w:r>
+        <w:t>user_type</w:t>
       </w:r>
       <w:proofErr w:type="spellEnd"/>
       <w:r>
@@ -1682,12 +1288,10 @@
         <w:t>        "username": "</w:t>
       </w:r>
       <w:proofErr w:type="spellStart"/>
-      <w:proofErr w:type="gramStart"/>
       <w:r>
         <w:t>test.general</w:t>
       </w:r>
       <w:proofErr w:type="spellEnd"/>
-      <w:proofErr w:type="gramEnd"/>
       <w:r>
         <w:t>"</w:t>
       </w:r>
@@ -1768,36 +1372,21 @@
     </w:p>
     <w:p>
       <w:r>
-        <w:t>    "data</w:t>
-      </w:r>
-      <w:proofErr w:type="gramStart"/>
-      <w:r>
-        <w:t>": {</w:t>
-      </w:r>
-      <w:proofErr w:type="gramEnd"/>
-    </w:p>
-    <w:p>
-      <w:r>
-        <w:t>        "employees</w:t>
-      </w:r>
-      <w:proofErr w:type="gramStart"/>
-      <w:r>
-        <w:t>": {</w:t>
-      </w:r>
-      <w:proofErr w:type="gramEnd"/>
+        <w:t>    "data": {</w:t>
+      </w:r>
+    </w:p>
+    <w:p>
+      <w:r>
+        <w:t>        "employees": {</w:t>
+      </w:r>
     </w:p>
     <w:p>
       <w:r>
         <w:t>            "</w:t>
       </w:r>
       <w:proofErr w:type="spellStart"/>
-      <w:proofErr w:type="gramStart"/>
-      <w:r>
-        <w:t>direct</w:t>
-      </w:r>
-      <w:proofErr w:type="gramEnd"/>
-      <w:r>
-        <w:t>_employees</w:t>
+      <w:r>
+        <w:t>direct_employees</w:t>
       </w:r>
       <w:proofErr w:type="spellEnd"/>
       <w:r>
@@ -1809,13 +1398,8 @@
         <w:t>            "</w:t>
       </w:r>
       <w:proofErr w:type="spellStart"/>
-      <w:proofErr w:type="gramStart"/>
-      <w:r>
-        <w:t>all</w:t>
-      </w:r>
-      <w:proofErr w:type="gramEnd"/>
-      <w:r>
-        <w:t>_employees</w:t>
+      <w:r>
+        <w:t>all_employees</w:t>
       </w:r>
       <w:proofErr w:type="spellEnd"/>
       <w:r>
@@ -1829,26 +1413,16 @@
     </w:p>
     <w:p>
       <w:r>
-        <w:t>        "devices</w:t>
-      </w:r>
-      <w:proofErr w:type="gramStart"/>
-      <w:r>
-        <w:t>": {</w:t>
-      </w:r>
-      <w:proofErr w:type="gramEnd"/>
+        <w:t>        "devices": {</w:t>
+      </w:r>
     </w:p>
     <w:p>
       <w:r>
         <w:t>            "</w:t>
       </w:r>
       <w:proofErr w:type="spellStart"/>
-      <w:proofErr w:type="gramStart"/>
-      <w:r>
-        <w:t>assigned</w:t>
-      </w:r>
-      <w:proofErr w:type="gramEnd"/>
-      <w:r>
-        <w:t>_devices</w:t>
+      <w:r>
+        <w:t>assigned_devices</w:t>
       </w:r>
       <w:proofErr w:type="spellEnd"/>
       <w:r>
@@ -1862,13 +1436,8 @@
     </w:p>
     <w:p>
       <w:r>
-        <w:t>        "tickets</w:t>
-      </w:r>
-      <w:proofErr w:type="gramStart"/>
-      <w:r>
-        <w:t>": {</w:t>
-      </w:r>
-      <w:proofErr w:type="gramEnd"/>
+        <w:t>        "tickets": {</w:t>
+      </w:r>
     </w:p>
     <w:p>
       <w:r>
@@ -1928,13 +1497,8 @@
     </w:p>
     <w:p/>
     <w:p>
-      <w:proofErr w:type="gramStart"/>
-      <w:r>
-        <w:t>Method  GET</w:t>
-      </w:r>
-      <w:proofErr w:type="gramEnd"/>
-      <w:r>
-        <w:t xml:space="preserve"> : </w:t>
+      <w:r>
+        <w:t xml:space="preserve">Method  GET : </w:t>
       </w:r>
       <w:r>
         <w:t>http://127.0.0.1:8080/api/v1/user/dashboard</w:t>
@@ -1947,36 +1511,21 @@
     </w:p>
     <w:p>
       <w:r>
-        <w:t>    "data</w:t>
-      </w:r>
-      <w:proofErr w:type="gramStart"/>
-      <w:r>
-        <w:t>": {</w:t>
-      </w:r>
-      <w:proofErr w:type="gramEnd"/>
-    </w:p>
-    <w:p>
-      <w:r>
-        <w:t>        "employee</w:t>
-      </w:r>
-      <w:proofErr w:type="gramStart"/>
-      <w:r>
-        <w:t>": {</w:t>
-      </w:r>
-      <w:proofErr w:type="gramEnd"/>
+        <w:t>    "data": {</w:t>
+      </w:r>
+    </w:p>
+    <w:p>
+      <w:r>
+        <w:t>        "employee": {</w:t>
+      </w:r>
     </w:p>
     <w:p>
       <w:r>
         <w:t>            "</w:t>
       </w:r>
       <w:proofErr w:type="spellStart"/>
-      <w:proofErr w:type="gramStart"/>
-      <w:r>
-        <w:t>employee</w:t>
-      </w:r>
-      <w:proofErr w:type="gramEnd"/>
-      <w:r>
-        <w:t>_id</w:t>
+      <w:r>
+        <w:t>employee_id</w:t>
       </w:r>
       <w:proofErr w:type="spellEnd"/>
       <w:r>
@@ -1985,25 +1534,30 @@
     </w:p>
     <w:p>
       <w:r>
+        <w:t>            "employee_name": "Brig Gen Md. Rafiqur Rahman, psc (retd)",</w:t>
+      </w:r>
+    </w:p>
+    <w:p>
+      <w:r>
+        <w:t>            "designation": "Managing Director",</w:t>
+      </w:r>
+    </w:p>
+    <w:p>
+      <w:r>
+        <w:t>            "department": "MD Office",</w:t>
+      </w:r>
+    </w:p>
+    <w:p>
+      <w:r>
         <w:t>            "</w:t>
       </w:r>
-      <w:proofErr w:type="gramStart"/>
-      <w:r>
-        <w:t>employee</w:t>
-      </w:r>
-      <w:proofErr w:type="gramEnd"/>
-      <w:r>
-        <w:t>_name": "Brig Gen Md. Rafiqur Rahman, psc (retd)",</w:t>
-      </w:r>
-    </w:p>
-    <w:p>
-      <w:r>
-        <w:t>            "designation": "Managing Director",</w:t>
-      </w:r>
-    </w:p>
-    <w:p>
-      <w:r>
-        <w:t>            "department": "MD Office",</w:t>
+      <w:proofErr w:type="spellStart"/>
+      <w:r>
+        <w:t>work_field</w:t>
+      </w:r>
+      <w:proofErr w:type="spellEnd"/>
+      <w:r>
+        <w:t>": "",</w:t>
       </w:r>
     </w:p>
     <w:p>
@@ -2011,13 +1565,8 @@
         <w:t>            "</w:t>
       </w:r>
       <w:proofErr w:type="spellStart"/>
-      <w:proofErr w:type="gramStart"/>
-      <w:r>
-        <w:t>work</w:t>
-      </w:r>
-      <w:proofErr w:type="gramEnd"/>
-      <w:r>
-        <w:t>_field</w:t>
+      <w:r>
+        <w:t>sub_function</w:t>
       </w:r>
       <w:proofErr w:type="spellEnd"/>
       <w:r>
@@ -2026,25 +1575,20 @@
     </w:p>
     <w:p>
       <w:r>
+        <w:t>            "active": "Yes",</w:t>
+      </w:r>
+    </w:p>
+    <w:p>
+      <w:r>
         <w:t>            "</w:t>
       </w:r>
       <w:proofErr w:type="spellStart"/>
-      <w:proofErr w:type="gramStart"/>
-      <w:r>
-        <w:t>sub</w:t>
-      </w:r>
-      <w:proofErr w:type="gramEnd"/>
-      <w:r>
-        <w:t>_function</w:t>
-      </w:r>
-      <w:proofErr w:type="spellEnd"/>
-      <w:r>
-        <w:t>": "",</w:t>
-      </w:r>
-    </w:p>
-    <w:p>
-      <w:r>
-        <w:t>            "active": "Yes",</w:t>
+      <w:r>
+        <w:t>personal_cell</w:t>
+      </w:r>
+      <w:proofErr w:type="spellEnd"/>
+      <w:r>
+        <w:t>": "01552367708",</w:t>
       </w:r>
     </w:p>
     <w:p>
@@ -2052,13 +1596,8 @@
         <w:t>            "</w:t>
       </w:r>
       <w:proofErr w:type="spellStart"/>
-      <w:proofErr w:type="gramStart"/>
-      <w:r>
-        <w:t>personal</w:t>
-      </w:r>
-      <w:proofErr w:type="gramEnd"/>
-      <w:r>
-        <w:t>_cell</w:t>
+      <w:r>
+        <w:t>official_cell</w:t>
       </w:r>
       <w:proofErr w:type="spellEnd"/>
       <w:r>
@@ -2067,39 +1606,16 @@
     </w:p>
     <w:p>
       <w:r>
+        <w:t>            "email": "",</w:t>
+      </w:r>
+    </w:p>
+    <w:p>
+      <w:r>
         <w:t>            "</w:t>
       </w:r>
       <w:proofErr w:type="spellStart"/>
-      <w:proofErr w:type="gramStart"/>
-      <w:r>
-        <w:t>official</w:t>
-      </w:r>
-      <w:proofErr w:type="gramEnd"/>
-      <w:r>
-        <w:t>_cell</w:t>
-      </w:r>
-      <w:proofErr w:type="spellEnd"/>
-      <w:r>
-        <w:t>": "01552367708",</w:t>
-      </w:r>
-    </w:p>
-    <w:p>
-      <w:r>
-        <w:t>            "email": "",</w:t>
-      </w:r>
-    </w:p>
-    <w:p>
-      <w:r>
-        <w:t>            "</w:t>
-      </w:r>
-      <w:proofErr w:type="spellStart"/>
-      <w:proofErr w:type="gramStart"/>
-      <w:r>
-        <w:t>official</w:t>
-      </w:r>
-      <w:proofErr w:type="gramEnd"/>
-      <w:r>
-        <w:t>_email</w:t>
+      <w:r>
+        <w:t>official_email</w:t>
       </w:r>
       <w:proofErr w:type="spellEnd"/>
       <w:r>
@@ -2126,13 +1642,8 @@
     </w:p>
     <w:p>
       <w:r>
-        <w:t>        "tickets</w:t>
-      </w:r>
-      <w:proofErr w:type="gramStart"/>
-      <w:r>
-        <w:t>": {</w:t>
-      </w:r>
-      <w:proofErr w:type="gramEnd"/>
+        <w:t>        "tickets": {</w:t>
+      </w:r>
     </w:p>
     <w:p>
       <w:r>
@@ -2186,7 +1697,7 @@
     <w:p/>
     <w:p/>
     <w:p>
-      <w:hyperlink r:id="rId15" w:history="1">
+      <w:hyperlink r:id="rId16" w:history="1">
         <w:r>
           <w:rPr>
             <w:rStyle w:val="Hyperlink"/>
@@ -2203,36 +1714,21 @@
     </w:p>
     <w:p>
       <w:r>
-        <w:t>    "data</w:t>
-      </w:r>
-      <w:proofErr w:type="gramStart"/>
-      <w:r>
-        <w:t>": {</w:t>
-      </w:r>
-      <w:proofErr w:type="gramEnd"/>
-    </w:p>
-    <w:p>
-      <w:r>
-        <w:t>        "employees</w:t>
-      </w:r>
-      <w:proofErr w:type="gramStart"/>
-      <w:r>
-        <w:t>": {</w:t>
-      </w:r>
-      <w:proofErr w:type="gramEnd"/>
+        <w:t>    "data": {</w:t>
+      </w:r>
+    </w:p>
+    <w:p>
+      <w:r>
+        <w:t>        "employees": {</w:t>
+      </w:r>
     </w:p>
     <w:p>
       <w:r>
         <w:t>            "</w:t>
       </w:r>
       <w:proofErr w:type="spellStart"/>
-      <w:proofErr w:type="gramStart"/>
-      <w:r>
-        <w:t>direct</w:t>
-      </w:r>
-      <w:proofErr w:type="gramEnd"/>
-      <w:r>
-        <w:t>_employees</w:t>
+      <w:r>
+        <w:t>direct_employees</w:t>
       </w:r>
       <w:proofErr w:type="spellEnd"/>
       <w:r>
@@ -2244,13 +1740,8 @@
         <w:t>            "</w:t>
       </w:r>
       <w:proofErr w:type="spellStart"/>
-      <w:proofErr w:type="gramStart"/>
-      <w:r>
-        <w:t>all</w:t>
-      </w:r>
-      <w:proofErr w:type="gramEnd"/>
-      <w:r>
-        <w:t>_employees</w:t>
+      <w:r>
+        <w:t>all_employees</w:t>
       </w:r>
       <w:proofErr w:type="spellEnd"/>
       <w:r>
@@ -2264,26 +1755,16 @@
     </w:p>
     <w:p>
       <w:r>
-        <w:t>        "devices</w:t>
-      </w:r>
-      <w:proofErr w:type="gramStart"/>
-      <w:r>
-        <w:t>": {</w:t>
-      </w:r>
-      <w:proofErr w:type="gramEnd"/>
+        <w:t>        "devices": {</w:t>
+      </w:r>
     </w:p>
     <w:p>
       <w:r>
         <w:t>            "</w:t>
       </w:r>
       <w:proofErr w:type="spellStart"/>
-      <w:proofErr w:type="gramStart"/>
-      <w:r>
-        <w:t>assigned</w:t>
-      </w:r>
-      <w:proofErr w:type="gramEnd"/>
-      <w:r>
-        <w:t>_devices</w:t>
+      <w:r>
+        <w:t>assigned_devices</w:t>
       </w:r>
       <w:proofErr w:type="spellEnd"/>
       <w:r>
@@ -2297,13 +1778,8 @@
     </w:p>
     <w:p>
       <w:r>
-        <w:t>        "tickets</w:t>
-      </w:r>
-      <w:proofErr w:type="gramStart"/>
-      <w:r>
-        <w:t>": {</w:t>
-      </w:r>
-      <w:proofErr w:type="gramEnd"/>
+        <w:t>        "tickets": {</w:t>
+      </w:r>
     </w:p>
     <w:p>
       <w:r>
@@ -2503,6 +1979,66 @@
       <w:proofErr w:type="spellEnd"/>
       <w:r>
         <w:t>"</w:t>
+      </w:r>
+    </w:p>
+    <w:p/>
+    <w:p/>
+    <w:p/>
+    <w:p/>
+    <w:p>
+      <w:hyperlink r:id="rId17" w:history="1">
+        <w:r>
+          <w:rPr>
+            <w:rStyle w:val="Hyperlink"/>
+          </w:rPr>
+          <w:t>http://127.0.0.1:8080/api/v1/user/sidebar-summary</w:t>
+        </w:r>
+      </w:hyperlink>
+    </w:p>
+    <w:p/>
+    <w:p/>
+    <w:p/>
+    <w:p/>
+    <w:p/>
+    <w:p/>
+    <w:p/>
+    <w:p>
+      <w:r>
+        <w:drawing>
+          <wp:inline distT="0" distB="0" distL="0" distR="0" wp14:anchorId="7417E1D2" wp14:editId="439FEC25">
+            <wp:extent cx="5943600" cy="3052445"/>
+            <wp:effectExtent l="0" t="0" r="0" b="0"/>
+            <wp:docPr id="1888828073" name="Picture 1"/>
+            <wp:cNvGraphicFramePr>
+              <a:graphicFrameLocks xmlns:a="http://schemas.openxmlformats.org/drawingml/2006/main" noChangeAspect="1"/>
+            </wp:cNvGraphicFramePr>
+            <a:graphic xmlns:a="http://schemas.openxmlformats.org/drawingml/2006/main">
+              <a:graphicData uri="http://schemas.openxmlformats.org/drawingml/2006/picture">
+                <pic:pic xmlns:pic="http://schemas.openxmlformats.org/drawingml/2006/picture">
+                  <pic:nvPicPr>
+                    <pic:cNvPr id="1888828073" name=""/>
+                    <pic:cNvPicPr/>
+                  </pic:nvPicPr>
+                  <pic:blipFill>
+                    <a:blip r:embed="rId18"/>
+                    <a:stretch>
+                      <a:fillRect/>
+                    </a:stretch>
+                  </pic:blipFill>
+                  <pic:spPr>
+                    <a:xfrm>
+                      <a:off x="0" y="0"/>
+                      <a:ext cx="5943600" cy="3052445"/>
+                    </a:xfrm>
+                    <a:prstGeom prst="rect">
+                      <a:avLst/>
+                    </a:prstGeom>
+                  </pic:spPr>
+                </pic:pic>
+              </a:graphicData>
+            </a:graphic>
+          </wp:inline>
+        </w:drawing>
       </w:r>
     </w:p>
     <w:p/>

</xml_diff>

<commit_message>
To Add Active Downstream Employees and Deviecs only
</commit_message>
<xml_diff>
--- a/document/Login as IT Personnel.docx
+++ b/document/Login as IT Personnel.docx
@@ -169,7 +169,15 @@
     </w:p>
     <w:p>
       <w:r>
-        <w:t xml:space="preserve">    COUNT(*) AS </w:t>
+        <w:t xml:space="preserve">    </w:t>
+      </w:r>
+      <w:proofErr w:type="gramStart"/>
+      <w:r>
+        <w:t>COUNT(</w:t>
+      </w:r>
+      <w:proofErr w:type="gramEnd"/>
+      <w:r>
+        <w:t xml:space="preserve">*) AS </w:t>
       </w:r>
       <w:proofErr w:type="spellStart"/>
       <w:r>
@@ -184,7 +192,23 @@
     </w:p>
     <w:p>
       <w:r>
-        <w:t xml:space="preserve">    SELECT NULLIF(BTRIM(tr1), '') AS </w:t>
+        <w:t xml:space="preserve">    SELECT NULLIF(</w:t>
+      </w:r>
+      <w:proofErr w:type="gramStart"/>
+      <w:r>
+        <w:t>BTRIM(</w:t>
+      </w:r>
+      <w:proofErr w:type="gramEnd"/>
+      <w:r>
+        <w:t>tr1</w:t>
+      </w:r>
+      <w:proofErr w:type="gramStart"/>
+      <w:r>
+        <w:t>), '</w:t>
+      </w:r>
+      <w:proofErr w:type="gramEnd"/>
+      <w:r>
+        <w:t xml:space="preserve">') AS </w:t>
       </w:r>
       <w:proofErr w:type="spellStart"/>
       <w:r>
@@ -197,8 +221,13 @@
         <w:t xml:space="preserve">    FROM </w:t>
       </w:r>
       <w:proofErr w:type="spellStart"/>
-      <w:r>
-        <w:t>public.employee_tier</w:t>
+      <w:proofErr w:type="gramStart"/>
+      <w:r>
+        <w:t>public.employee</w:t>
+      </w:r>
+      <w:proofErr w:type="gramEnd"/>
+      <w:r>
+        <w:t>_tier</w:t>
       </w:r>
       <w:proofErr w:type="spellEnd"/>
     </w:p>
@@ -211,7 +240,23 @@
     <w:p/>
     <w:p>
       <w:r>
-        <w:t xml:space="preserve">    SELECT NULLIF(BTRIM(tr2), '')</w:t>
+        <w:t xml:space="preserve">    SELECT NULLIF(</w:t>
+      </w:r>
+      <w:proofErr w:type="gramStart"/>
+      <w:r>
+        <w:t>BTRIM(</w:t>
+      </w:r>
+      <w:proofErr w:type="gramEnd"/>
+      <w:r>
+        <w:t>tr2</w:t>
+      </w:r>
+      <w:proofErr w:type="gramStart"/>
+      <w:r>
+        <w:t>), '</w:t>
+      </w:r>
+      <w:proofErr w:type="gramEnd"/>
+      <w:r>
+        <w:t>')</w:t>
       </w:r>
     </w:p>
     <w:p>
@@ -220,8 +265,13 @@
         <w:t xml:space="preserve">    FROM </w:t>
       </w:r>
       <w:proofErr w:type="spellStart"/>
-      <w:r>
-        <w:t>public.employee_tier</w:t>
+      <w:proofErr w:type="gramStart"/>
+      <w:r>
+        <w:t>public.employee</w:t>
+      </w:r>
+      <w:proofErr w:type="gramEnd"/>
+      <w:r>
+        <w:t>_tier</w:t>
       </w:r>
       <w:proofErr w:type="spellEnd"/>
     </w:p>
@@ -234,7 +284,15 @@
     <w:p/>
     <w:p>
       <w:r>
-        <w:t xml:space="preserve">    SELECT NULLIF(BTRIM(tr3), '')</w:t>
+        <w:t xml:space="preserve">    SELECT NULLIF(</w:t>
+      </w:r>
+      <w:proofErr w:type="gramStart"/>
+      <w:r>
+        <w:t>BTRIM(</w:t>
+      </w:r>
+      <w:proofErr w:type="gramEnd"/>
+      <w:r>
+        <w:t>tr3), '')</w:t>
       </w:r>
     </w:p>
     <w:p>
@@ -242,8 +300,13 @@
         <w:t xml:space="preserve">    FROM </w:t>
       </w:r>
       <w:proofErr w:type="spellStart"/>
-      <w:r>
-        <w:t>public.employee_tier</w:t>
+      <w:proofErr w:type="gramStart"/>
+      <w:r>
+        <w:t>public.employee</w:t>
+      </w:r>
+      <w:proofErr w:type="gramEnd"/>
+      <w:r>
+        <w:t>_tier</w:t>
       </w:r>
       <w:proofErr w:type="spellEnd"/>
     </w:p>
@@ -256,7 +319,15 @@
     <w:p/>
     <w:p>
       <w:r>
-        <w:t xml:space="preserve">    SELECT NULLIF(BTRIM(tr4), '')</w:t>
+        <w:t xml:space="preserve">    SELECT NULLIF(</w:t>
+      </w:r>
+      <w:proofErr w:type="gramStart"/>
+      <w:r>
+        <w:t>BTRIM(</w:t>
+      </w:r>
+      <w:proofErr w:type="gramEnd"/>
+      <w:r>
+        <w:t>tr4), '')</w:t>
       </w:r>
     </w:p>
     <w:p>
@@ -264,8 +335,13 @@
         <w:t xml:space="preserve">    FROM </w:t>
       </w:r>
       <w:proofErr w:type="spellStart"/>
-      <w:r>
-        <w:t>public.employee_tier</w:t>
+      <w:proofErr w:type="gramStart"/>
+      <w:r>
+        <w:t>public.employee</w:t>
+      </w:r>
+      <w:proofErr w:type="gramEnd"/>
+      <w:r>
+        <w:t>_tier</w:t>
       </w:r>
       <w:proofErr w:type="spellEnd"/>
     </w:p>
@@ -278,7 +354,23 @@
     <w:p/>
     <w:p>
       <w:r>
-        <w:t xml:space="preserve">    SELECT NULLIF(BTRIM(tr5), '')</w:t>
+        <w:t xml:space="preserve">    SELECT NULLIF(</w:t>
+      </w:r>
+      <w:proofErr w:type="gramStart"/>
+      <w:r>
+        <w:t>BTRIM(</w:t>
+      </w:r>
+      <w:proofErr w:type="gramEnd"/>
+      <w:r>
+        <w:t xml:space="preserve">tr5), </w:t>
+      </w:r>
+      <w:proofErr w:type="gramStart"/>
+      <w:r>
+        <w:t>''</w:t>
+      </w:r>
+      <w:proofErr w:type="gramEnd"/>
+      <w:r>
+        <w:t>)</w:t>
       </w:r>
     </w:p>
     <w:p>
@@ -286,8 +378,13 @@
         <w:t xml:space="preserve">    FROM </w:t>
       </w:r>
       <w:proofErr w:type="spellStart"/>
-      <w:r>
-        <w:t>public.employee_tier</w:t>
+      <w:proofErr w:type="gramStart"/>
+      <w:r>
+        <w:t>public.employee</w:t>
+      </w:r>
+      <w:proofErr w:type="gramEnd"/>
+      <w:r>
+        <w:t>_tier</w:t>
       </w:r>
       <w:proofErr w:type="spellEnd"/>
     </w:p>
@@ -300,7 +397,23 @@
     <w:p/>
     <w:p>
       <w:r>
-        <w:t xml:space="preserve">    SELECT NULLIF(BTRIM(tr6), '')</w:t>
+        <w:t xml:space="preserve">    SELECT NULLIF(</w:t>
+      </w:r>
+      <w:proofErr w:type="gramStart"/>
+      <w:r>
+        <w:t>BTRIM(</w:t>
+      </w:r>
+      <w:proofErr w:type="gramEnd"/>
+      <w:r>
+        <w:t>tr6</w:t>
+      </w:r>
+      <w:proofErr w:type="gramStart"/>
+      <w:r>
+        <w:t>), '</w:t>
+      </w:r>
+      <w:proofErr w:type="gramEnd"/>
+      <w:r>
+        <w:t>')</w:t>
       </w:r>
     </w:p>
     <w:p>
@@ -308,8 +421,13 @@
         <w:t xml:space="preserve">    FROM </w:t>
       </w:r>
       <w:proofErr w:type="spellStart"/>
-      <w:r>
-        <w:t>public.employee_tier</w:t>
+      <w:proofErr w:type="gramStart"/>
+      <w:r>
+        <w:t>public.employee</w:t>
+      </w:r>
+      <w:proofErr w:type="gramEnd"/>
+      <w:r>
+        <w:t>_tier</w:t>
       </w:r>
       <w:proofErr w:type="spellEnd"/>
     </w:p>
@@ -417,11 +535,24 @@
     </w:p>
     <w:p>
       <w:r>
-        <w:t xml:space="preserve">    COUNT(DISTINCT </w:t>
-      </w:r>
-      <w:proofErr w:type="spellStart"/>
-      <w:r>
-        <w:t>et.employee_id</w:t>
+        <w:t xml:space="preserve">    </w:t>
+      </w:r>
+      <w:proofErr w:type="gramStart"/>
+      <w:r>
+        <w:t>COUNT(</w:t>
+      </w:r>
+      <w:proofErr w:type="gramEnd"/>
+      <w:r>
+        <w:t xml:space="preserve">DISTINCT </w:t>
+      </w:r>
+      <w:proofErr w:type="spellStart"/>
+      <w:proofErr w:type="gramStart"/>
+      <w:r>
+        <w:t>et.employee</w:t>
+      </w:r>
+      <w:proofErr w:type="gramEnd"/>
+      <w:r>
+        <w:t>_id</w:t>
       </w:r>
       <w:proofErr w:type="spellEnd"/>
       <w:r>
@@ -439,8 +570,13 @@
     <w:p/>
     <w:p>
       <w:r>
-        <w:t xml:space="preserve">    COUNT(</w:t>
-      </w:r>
+        <w:t xml:space="preserve">    </w:t>
+      </w:r>
+      <w:proofErr w:type="gramStart"/>
+      <w:r>
+        <w:t>COUNT(</w:t>
+      </w:r>
+      <w:proofErr w:type="gramEnd"/>
     </w:p>
     <w:p>
       <w:r>
@@ -450,12 +586,25 @@
     </w:p>
     <w:p>
       <w:r>
-        <w:t xml:space="preserve">            WHEN BTRIM(</w:t>
-      </w:r>
-    </w:p>
-    <w:p>
-      <w:r>
-        <w:t xml:space="preserve">                COALESCE(et.tr1, '')</w:t>
+        <w:t xml:space="preserve">            WHEN </w:t>
+      </w:r>
+      <w:proofErr w:type="gramStart"/>
+      <w:r>
+        <w:t>BTRIM(</w:t>
+      </w:r>
+      <w:proofErr w:type="gramEnd"/>
+    </w:p>
+    <w:p>
+      <w:r>
+        <w:t xml:space="preserve">                </w:t>
+      </w:r>
+      <w:proofErr w:type="gramStart"/>
+      <w:r>
+        <w:t>COALESCE(</w:t>
+      </w:r>
+      <w:proofErr w:type="gramEnd"/>
+      <w:r>
+        <w:t>et.tr1, '')</w:t>
       </w:r>
     </w:p>
     <w:p>
@@ -468,8 +617,13 @@
         <w:t xml:space="preserve">            THEN </w:t>
       </w:r>
       <w:proofErr w:type="spellStart"/>
-      <w:r>
-        <w:t>et.employee_id</w:t>
+      <w:proofErr w:type="gramStart"/>
+      <w:r>
+        <w:t>et.employee</w:t>
+      </w:r>
+      <w:proofErr w:type="gramEnd"/>
+      <w:r>
+        <w:t>_id</w:t>
       </w:r>
       <w:proofErr w:type="spellEnd"/>
     </w:p>
@@ -494,8 +648,13 @@
         <w:t xml:space="preserve">FROM </w:t>
       </w:r>
       <w:proofErr w:type="spellStart"/>
-      <w:r>
-        <w:t>public.employee_tier</w:t>
+      <w:proofErr w:type="gramStart"/>
+      <w:r>
+        <w:t>public.employee</w:t>
+      </w:r>
+      <w:proofErr w:type="gramEnd"/>
+      <w:r>
+        <w:t>_tier</w:t>
       </w:r>
       <w:proofErr w:type="spellEnd"/>
       <w:r>
@@ -504,38 +663,88 @@
     </w:p>
     <w:p/>
     <w:p>
+      <w:proofErr w:type="gramStart"/>
       <w:r>
         <w:t>WHERE</w:t>
       </w:r>
-    </w:p>
-    <w:p>
-      <w:r>
-        <w:t xml:space="preserve">       BTRIM(COALESCE(et.tr1, '')) = '02-0003'</w:t>
-      </w:r>
-    </w:p>
-    <w:p>
-      <w:r>
-        <w:t xml:space="preserve">    OR BTRIM(COALESCE(et.tr2, '')) = '02-0003'</w:t>
-      </w:r>
-    </w:p>
-    <w:p>
-      <w:r>
-        <w:t xml:space="preserve">    OR BTRIM(COALESCE(et.tr3, '')) = '02-0003'</w:t>
-      </w:r>
-    </w:p>
-    <w:p>
-      <w:r>
-        <w:t xml:space="preserve">    OR BTRIM(COALESCE(et.tr4, '')) = '02-0003'</w:t>
-      </w:r>
-    </w:p>
-    <w:p>
-      <w:r>
-        <w:t xml:space="preserve">    OR BTRIM(COALESCE(et.tr5, '')) = '02-0003'</w:t>
-      </w:r>
-    </w:p>
-    <w:p>
-      <w:r>
-        <w:t xml:space="preserve">    OR BTRIM(COALESCE(et.tr6, '')) = '02-0003';</w:t>
+      <w:proofErr w:type="gramEnd"/>
+    </w:p>
+    <w:p>
+      <w:r>
+        <w:t xml:space="preserve">       </w:t>
+      </w:r>
+      <w:proofErr w:type="gramStart"/>
+      <w:r>
+        <w:t>BTRIM(COALESCE(et.tr1, '</w:t>
+      </w:r>
+      <w:proofErr w:type="gramEnd"/>
+      <w:r>
+        <w:t>')) = '02-0003'</w:t>
+      </w:r>
+    </w:p>
+    <w:p>
+      <w:r>
+        <w:t xml:space="preserve">    OR </w:t>
+      </w:r>
+      <w:proofErr w:type="gramStart"/>
+      <w:r>
+        <w:t>BTRIM(COALESCE(et.tr2, '</w:t>
+      </w:r>
+      <w:proofErr w:type="gramEnd"/>
+      <w:r>
+        <w:t>')) = '02-0003'</w:t>
+      </w:r>
+    </w:p>
+    <w:p>
+      <w:r>
+        <w:t xml:space="preserve">    OR </w:t>
+      </w:r>
+      <w:proofErr w:type="gramStart"/>
+      <w:r>
+        <w:t>BTRIM(COALESCE(et.tr3, '</w:t>
+      </w:r>
+      <w:proofErr w:type="gramEnd"/>
+      <w:r>
+        <w:t>')) = '02-0003'</w:t>
+      </w:r>
+    </w:p>
+    <w:p>
+      <w:r>
+        <w:t xml:space="preserve">    OR </w:t>
+      </w:r>
+      <w:proofErr w:type="gramStart"/>
+      <w:r>
+        <w:t>BTRIM(COALESCE(</w:t>
+      </w:r>
+      <w:proofErr w:type="gramEnd"/>
+      <w:r>
+        <w:t>et.tr4, '')) = '02-0003'</w:t>
+      </w:r>
+    </w:p>
+    <w:p>
+      <w:r>
+        <w:t xml:space="preserve">    OR </w:t>
+      </w:r>
+      <w:proofErr w:type="gramStart"/>
+      <w:r>
+        <w:t>BTRIM(COALESCE(</w:t>
+      </w:r>
+      <w:proofErr w:type="gramEnd"/>
+      <w:r>
+        <w:t>et.tr5, '')) = '02-0003'</w:t>
+      </w:r>
+    </w:p>
+    <w:p>
+      <w:r>
+        <w:t xml:space="preserve">    OR </w:t>
+      </w:r>
+      <w:proofErr w:type="gramStart"/>
+      <w:r>
+        <w:t>BTRIM(COALESCE(</w:t>
+      </w:r>
+      <w:proofErr w:type="gramEnd"/>
+      <w:r>
+        <w:t>et.tr6, '')) = '02-0003';</w:t>
       </w:r>
     </w:p>
     <w:p/>
@@ -604,8 +813,13 @@
       </w:r>
     </w:p>
     <w:p>
-      <w:r>
-        <w:t>Method : Get</w:t>
+      <w:proofErr w:type="gramStart"/>
+      <w:r>
+        <w:t>Method :</w:t>
+      </w:r>
+      <w:proofErr w:type="gramEnd"/>
+      <w:r>
+        <w:t xml:space="preserve"> Get</w:t>
       </w:r>
     </w:p>
     <w:p>
@@ -727,16 +941,26 @@
     </w:p>
     <w:p>
       <w:r>
-        <w:t>    "data": {</w:t>
-      </w:r>
+        <w:t>    "data</w:t>
+      </w:r>
+      <w:proofErr w:type="gramStart"/>
+      <w:r>
+        <w:t>": {</w:t>
+      </w:r>
+      <w:proofErr w:type="gramEnd"/>
     </w:p>
     <w:p>
       <w:r>
         <w:t>        "</w:t>
       </w:r>
       <w:proofErr w:type="spellStart"/>
-      <w:r>
-        <w:t>account_status</w:t>
+      <w:proofErr w:type="gramStart"/>
+      <w:r>
+        <w:t>account</w:t>
+      </w:r>
+      <w:proofErr w:type="gramEnd"/>
+      <w:r>
+        <w:t>_status</w:t>
       </w:r>
       <w:proofErr w:type="spellEnd"/>
       <w:r>
@@ -761,8 +985,13 @@
         <w:t>        "</w:t>
       </w:r>
       <w:proofErr w:type="spellStart"/>
-      <w:r>
-        <w:t>employee_id</w:t>
+      <w:proofErr w:type="gramStart"/>
+      <w:r>
+        <w:t>employee</w:t>
+      </w:r>
+      <w:proofErr w:type="gramEnd"/>
+      <w:r>
+        <w:t>_id</w:t>
       </w:r>
       <w:proofErr w:type="spellEnd"/>
       <w:r>
@@ -774,8 +1003,13 @@
         <w:t>        "</w:t>
       </w:r>
       <w:proofErr w:type="spellStart"/>
-      <w:r>
-        <w:t>full_name</w:t>
+      <w:proofErr w:type="gramStart"/>
+      <w:r>
+        <w:t>full</w:t>
+      </w:r>
+      <w:proofErr w:type="gramEnd"/>
+      <w:r>
+        <w:t>_name</w:t>
       </w:r>
       <w:proofErr w:type="spellEnd"/>
       <w:r>
@@ -787,8 +1021,13 @@
         <w:t>        "</w:t>
       </w:r>
       <w:proofErr w:type="spellStart"/>
-      <w:r>
-        <w:t>must_change_password</w:t>
+      <w:proofErr w:type="gramStart"/>
+      <w:r>
+        <w:t>must</w:t>
+      </w:r>
+      <w:proofErr w:type="gramEnd"/>
+      <w:r>
+        <w:t>_change_password</w:t>
       </w:r>
       <w:proofErr w:type="spellEnd"/>
       <w:r>
@@ -816,8 +1055,13 @@
         <w:t>            "</w:t>
       </w:r>
       <w:proofErr w:type="spellStart"/>
-      <w:r>
-        <w:t>dashboard.self.access</w:t>
+      <w:proofErr w:type="gramStart"/>
+      <w:r>
+        <w:t>dashboard.self</w:t>
+      </w:r>
+      <w:proofErr w:type="gramEnd"/>
+      <w:r>
+        <w:t>.access</w:t>
       </w:r>
       <w:proofErr w:type="spellEnd"/>
       <w:r>
@@ -834,8 +1078,13 @@
         <w:t>        "</w:t>
       </w:r>
       <w:proofErr w:type="spellStart"/>
-      <w:r>
-        <w:t>role_code</w:t>
+      <w:proofErr w:type="gramStart"/>
+      <w:r>
+        <w:t>role</w:t>
+      </w:r>
+      <w:proofErr w:type="gramEnd"/>
+      <w:r>
+        <w:t>_code</w:t>
       </w:r>
       <w:proofErr w:type="spellEnd"/>
       <w:r>
@@ -847,8 +1096,13 @@
         <w:t>        "</w:t>
       </w:r>
       <w:proofErr w:type="spellStart"/>
-      <w:r>
-        <w:t>role_name</w:t>
+      <w:proofErr w:type="gramStart"/>
+      <w:r>
+        <w:t>role</w:t>
+      </w:r>
+      <w:proofErr w:type="gramEnd"/>
+      <w:r>
+        <w:t>_name</w:t>
       </w:r>
       <w:proofErr w:type="spellEnd"/>
       <w:r>
@@ -860,8 +1114,13 @@
         <w:t>        "</w:t>
       </w:r>
       <w:proofErr w:type="spellStart"/>
-      <w:r>
-        <w:t>user_id</w:t>
+      <w:proofErr w:type="gramStart"/>
+      <w:r>
+        <w:t>user</w:t>
+      </w:r>
+      <w:proofErr w:type="gramEnd"/>
+      <w:r>
+        <w:t>_id</w:t>
       </w:r>
       <w:proofErr w:type="spellEnd"/>
       <w:r>
@@ -873,8 +1132,13 @@
         <w:t>        "</w:t>
       </w:r>
       <w:proofErr w:type="spellStart"/>
-      <w:r>
-        <w:t>user_type</w:t>
+      <w:proofErr w:type="gramStart"/>
+      <w:r>
+        <w:t>user</w:t>
+      </w:r>
+      <w:proofErr w:type="gramEnd"/>
+      <w:r>
+        <w:t>_type</w:t>
       </w:r>
       <w:proofErr w:type="spellEnd"/>
       <w:r>
@@ -886,10 +1150,12 @@
         <w:t>        "username": "</w:t>
       </w:r>
       <w:proofErr w:type="spellStart"/>
+      <w:proofErr w:type="gramStart"/>
       <w:r>
         <w:t>test.general</w:t>
       </w:r>
       <w:proofErr w:type="spellEnd"/>
+      <w:proofErr w:type="gramEnd"/>
       <w:r>
         <w:t>"</w:t>
       </w:r>
@@ -925,8 +1191,13 @@
     </w:p>
     <w:p>
       <w:r>
-        <w:t xml:space="preserve">    COUNT(</w:t>
-      </w:r>
+        <w:t xml:space="preserve">    </w:t>
+      </w:r>
+      <w:proofErr w:type="gramStart"/>
+      <w:r>
+        <w:t>COUNT(</w:t>
+      </w:r>
+      <w:proofErr w:type="gramEnd"/>
     </w:p>
     <w:p>
       <w:r>
@@ -935,16 +1206,32 @@
     </w:p>
     <w:p>
       <w:r>
-        <w:t xml:space="preserve">            WHEN BTRIM(COALESCE(et.tr1, '')) = '02-0003'</w:t>
-      </w:r>
-    </w:p>
-    <w:p>
-      <w:r>
-        <w:t xml:space="preserve">            THEN BTRIM(</w:t>
-      </w:r>
-      <w:proofErr w:type="spellStart"/>
-      <w:r>
-        <w:t>et.employee_id</w:t>
+        <w:t xml:space="preserve">            WHEN </w:t>
+      </w:r>
+      <w:proofErr w:type="gramStart"/>
+      <w:r>
+        <w:t>BTRIM(COALESCE(</w:t>
+      </w:r>
+      <w:proofErr w:type="gramEnd"/>
+      <w:r>
+        <w:t>et.tr1, '')) = '02-0003'</w:t>
+      </w:r>
+    </w:p>
+    <w:p>
+      <w:r>
+        <w:t xml:space="preserve">            THEN </w:t>
+      </w:r>
+      <w:proofErr w:type="gramStart"/>
+      <w:r>
+        <w:t>BTRIM(</w:t>
+      </w:r>
+      <w:proofErr w:type="spellStart"/>
+      <w:r>
+        <w:t>et.employee</w:t>
+      </w:r>
+      <w:proofErr w:type="gramEnd"/>
+      <w:r>
+        <w:t>_id</w:t>
       </w:r>
       <w:proofErr w:type="spellEnd"/>
       <w:r>
@@ -972,16 +1259,29 @@
     <w:p/>
     <w:p>
       <w:r>
-        <w:t xml:space="preserve">    COUNT(</w:t>
-      </w:r>
-    </w:p>
-    <w:p>
-      <w:r>
-        <w:t xml:space="preserve">        DISTINCT BTRIM(</w:t>
-      </w:r>
-      <w:proofErr w:type="spellStart"/>
-      <w:r>
-        <w:t>et.employee_id</w:t>
+        <w:t xml:space="preserve">    </w:t>
+      </w:r>
+      <w:proofErr w:type="gramStart"/>
+      <w:r>
+        <w:t>COUNT(</w:t>
+      </w:r>
+      <w:proofErr w:type="gramEnd"/>
+    </w:p>
+    <w:p>
+      <w:r>
+        <w:t xml:space="preserve">        DISTINCT </w:t>
+      </w:r>
+      <w:proofErr w:type="gramStart"/>
+      <w:r>
+        <w:t>BTRIM(</w:t>
+      </w:r>
+      <w:proofErr w:type="spellStart"/>
+      <w:r>
+        <w:t>et.employee</w:t>
+      </w:r>
+      <w:proofErr w:type="gramEnd"/>
+      <w:r>
+        <w:t>_id</w:t>
       </w:r>
       <w:proofErr w:type="spellEnd"/>
       <w:r>
@@ -1004,8 +1304,13 @@
         <w:t xml:space="preserve">FROM </w:t>
       </w:r>
       <w:proofErr w:type="spellStart"/>
-      <w:r>
-        <w:t>public.employee_tier</w:t>
+      <w:proofErr w:type="gramStart"/>
+      <w:r>
+        <w:t>public.employee</w:t>
+      </w:r>
+      <w:proofErr w:type="gramEnd"/>
+      <w:r>
+        <w:t>_tier</w:t>
       </w:r>
       <w:proofErr w:type="spellEnd"/>
       <w:r>
@@ -1014,39 +1319,89 @@
     </w:p>
     <w:p/>
     <w:p>
+      <w:proofErr w:type="gramStart"/>
       <w:r>
         <w:lastRenderedPageBreak/>
         <w:t>WHERE</w:t>
       </w:r>
-    </w:p>
-    <w:p>
-      <w:r>
-        <w:t xml:space="preserve">       BTRIM(COALESCE(et.tr1, '')) = '02-0003'</w:t>
-      </w:r>
-    </w:p>
-    <w:p>
-      <w:r>
-        <w:t xml:space="preserve">    OR BTRIM(COALESCE(et.tr2, '')) = '02-0003'</w:t>
-      </w:r>
-    </w:p>
-    <w:p>
-      <w:r>
-        <w:t xml:space="preserve">    OR BTRIM(COALESCE(et.tr3, '')) = '02-0003'</w:t>
-      </w:r>
-    </w:p>
-    <w:p>
-      <w:r>
-        <w:t xml:space="preserve">    OR BTRIM(COALESCE(et.tr4, '')) = '02-0003'</w:t>
-      </w:r>
-    </w:p>
-    <w:p>
-      <w:r>
-        <w:t xml:space="preserve">    OR BTRIM(COALESCE(et.tr5, '')) = '02-0003'</w:t>
-      </w:r>
-    </w:p>
-    <w:p>
-      <w:r>
-        <w:t xml:space="preserve">    OR BTRIM(COALESCE(et.tr6, '')) = '02-0003';</w:t>
+      <w:proofErr w:type="gramEnd"/>
+    </w:p>
+    <w:p>
+      <w:r>
+        <w:t xml:space="preserve">       </w:t>
+      </w:r>
+      <w:proofErr w:type="gramStart"/>
+      <w:r>
+        <w:t>BTRIM(COALESCE(et.tr1, '</w:t>
+      </w:r>
+      <w:proofErr w:type="gramEnd"/>
+      <w:r>
+        <w:t>')) = '02-0003'</w:t>
+      </w:r>
+    </w:p>
+    <w:p>
+      <w:r>
+        <w:t xml:space="preserve">    OR </w:t>
+      </w:r>
+      <w:proofErr w:type="gramStart"/>
+      <w:r>
+        <w:t>BTRIM(COALESCE(et.tr2, '</w:t>
+      </w:r>
+      <w:proofErr w:type="gramEnd"/>
+      <w:r>
+        <w:t>')) = '02-0003'</w:t>
+      </w:r>
+    </w:p>
+    <w:p>
+      <w:r>
+        <w:t xml:space="preserve">    OR </w:t>
+      </w:r>
+      <w:proofErr w:type="gramStart"/>
+      <w:r>
+        <w:t>BTRIM(COALESCE(et.tr3, '</w:t>
+      </w:r>
+      <w:proofErr w:type="gramEnd"/>
+      <w:r>
+        <w:t>')) = '02-0003'</w:t>
+      </w:r>
+    </w:p>
+    <w:p>
+      <w:r>
+        <w:t xml:space="preserve">    OR </w:t>
+      </w:r>
+      <w:proofErr w:type="gramStart"/>
+      <w:r>
+        <w:t>BTRIM(COALESCE(</w:t>
+      </w:r>
+      <w:proofErr w:type="gramEnd"/>
+      <w:r>
+        <w:t>et.tr4, '')) = '02-0003'</w:t>
+      </w:r>
+    </w:p>
+    <w:p>
+      <w:r>
+        <w:t xml:space="preserve">    OR </w:t>
+      </w:r>
+      <w:proofErr w:type="gramStart"/>
+      <w:r>
+        <w:t>BTRIM(COALESCE(</w:t>
+      </w:r>
+      <w:proofErr w:type="gramEnd"/>
+      <w:r>
+        <w:t>et.tr5, '')) = '02-0003'</w:t>
+      </w:r>
+    </w:p>
+    <w:p>
+      <w:r>
+        <w:t xml:space="preserve">    OR </w:t>
+      </w:r>
+      <w:proofErr w:type="gramStart"/>
+      <w:r>
+        <w:t>BTRIM(COALESCE(</w:t>
+      </w:r>
+      <w:proofErr w:type="gramEnd"/>
+      <w:r>
+        <w:t>et.tr6, '')) = '02-0003';</w:t>
       </w:r>
     </w:p>
     <w:p/>
@@ -1130,16 +1485,26 @@
     </w:p>
     <w:p>
       <w:r>
-        <w:t>    "data": {</w:t>
-      </w:r>
+        <w:t>    "data</w:t>
+      </w:r>
+      <w:proofErr w:type="gramStart"/>
+      <w:r>
+        <w:t>": {</w:t>
+      </w:r>
+      <w:proofErr w:type="gramEnd"/>
     </w:p>
     <w:p>
       <w:r>
         <w:t>        "</w:t>
       </w:r>
       <w:proofErr w:type="spellStart"/>
-      <w:r>
-        <w:t>account_status</w:t>
+      <w:proofErr w:type="gramStart"/>
+      <w:r>
+        <w:t>account</w:t>
+      </w:r>
+      <w:proofErr w:type="gramEnd"/>
+      <w:r>
+        <w:t>_status</w:t>
       </w:r>
       <w:proofErr w:type="spellEnd"/>
       <w:r>
@@ -1164,8 +1529,13 @@
         <w:t>        "</w:t>
       </w:r>
       <w:proofErr w:type="spellStart"/>
-      <w:r>
-        <w:t>employee_id</w:t>
+      <w:proofErr w:type="gramStart"/>
+      <w:r>
+        <w:t>employee</w:t>
+      </w:r>
+      <w:proofErr w:type="gramEnd"/>
+      <w:r>
+        <w:t>_id</w:t>
       </w:r>
       <w:proofErr w:type="spellEnd"/>
       <w:r>
@@ -1177,8 +1547,13 @@
         <w:t>        "</w:t>
       </w:r>
       <w:proofErr w:type="spellStart"/>
-      <w:r>
-        <w:t>full_name</w:t>
+      <w:proofErr w:type="gramStart"/>
+      <w:r>
+        <w:t>full</w:t>
+      </w:r>
+      <w:proofErr w:type="gramEnd"/>
+      <w:r>
+        <w:t>_name</w:t>
       </w:r>
       <w:proofErr w:type="spellEnd"/>
       <w:r>
@@ -1190,8 +1565,13 @@
         <w:t>        "</w:t>
       </w:r>
       <w:proofErr w:type="spellStart"/>
-      <w:r>
-        <w:t>must_change_password</w:t>
+      <w:proofErr w:type="gramStart"/>
+      <w:r>
+        <w:t>must</w:t>
+      </w:r>
+      <w:proofErr w:type="gramEnd"/>
+      <w:r>
+        <w:t>_change_password</w:t>
       </w:r>
       <w:proofErr w:type="spellEnd"/>
       <w:r>
@@ -1218,8 +1598,13 @@
         <w:t>            "</w:t>
       </w:r>
       <w:proofErr w:type="spellStart"/>
-      <w:r>
-        <w:t>dashboard.self.access</w:t>
+      <w:proofErr w:type="gramStart"/>
+      <w:r>
+        <w:t>dashboard.self</w:t>
+      </w:r>
+      <w:proofErr w:type="gramEnd"/>
+      <w:r>
+        <w:t>.access</w:t>
       </w:r>
       <w:proofErr w:type="spellEnd"/>
       <w:r>
@@ -1236,8 +1621,13 @@
         <w:t>        "</w:t>
       </w:r>
       <w:proofErr w:type="spellStart"/>
-      <w:r>
-        <w:t>role_code</w:t>
+      <w:proofErr w:type="gramStart"/>
+      <w:r>
+        <w:t>role</w:t>
+      </w:r>
+      <w:proofErr w:type="gramEnd"/>
+      <w:r>
+        <w:t>_code</w:t>
       </w:r>
       <w:proofErr w:type="spellEnd"/>
       <w:r>
@@ -1249,8 +1639,13 @@
         <w:t>        "</w:t>
       </w:r>
       <w:proofErr w:type="spellStart"/>
-      <w:r>
-        <w:t>role_name</w:t>
+      <w:proofErr w:type="gramStart"/>
+      <w:r>
+        <w:t>role</w:t>
+      </w:r>
+      <w:proofErr w:type="gramEnd"/>
+      <w:r>
+        <w:t>_name</w:t>
       </w:r>
       <w:proofErr w:type="spellEnd"/>
       <w:r>
@@ -1262,8 +1657,13 @@
         <w:t>        "</w:t>
       </w:r>
       <w:proofErr w:type="spellStart"/>
-      <w:r>
-        <w:t>user_id</w:t>
+      <w:proofErr w:type="gramStart"/>
+      <w:r>
+        <w:t>user</w:t>
+      </w:r>
+      <w:proofErr w:type="gramEnd"/>
+      <w:r>
+        <w:t>_id</w:t>
       </w:r>
       <w:proofErr w:type="spellEnd"/>
       <w:r>
@@ -1275,8 +1675,13 @@
         <w:t>        "</w:t>
       </w:r>
       <w:proofErr w:type="spellStart"/>
-      <w:r>
-        <w:t>user_type</w:t>
+      <w:proofErr w:type="gramStart"/>
+      <w:r>
+        <w:t>user</w:t>
+      </w:r>
+      <w:proofErr w:type="gramEnd"/>
+      <w:r>
+        <w:t>_type</w:t>
       </w:r>
       <w:proofErr w:type="spellEnd"/>
       <w:r>
@@ -1288,10 +1693,12 @@
         <w:t>        "username": "</w:t>
       </w:r>
       <w:proofErr w:type="spellStart"/>
+      <w:proofErr w:type="gramStart"/>
       <w:r>
         <w:t>test.general</w:t>
       </w:r>
       <w:proofErr w:type="spellEnd"/>
+      <w:proofErr w:type="gramEnd"/>
       <w:r>
         <w:t>"</w:t>
       </w:r>
@@ -1372,21 +1779,36 @@
     </w:p>
     <w:p>
       <w:r>
-        <w:t>    "data": {</w:t>
-      </w:r>
-    </w:p>
-    <w:p>
-      <w:r>
-        <w:t>        "employees": {</w:t>
-      </w:r>
+        <w:t>    "data</w:t>
+      </w:r>
+      <w:proofErr w:type="gramStart"/>
+      <w:r>
+        <w:t>": {</w:t>
+      </w:r>
+      <w:proofErr w:type="gramEnd"/>
+    </w:p>
+    <w:p>
+      <w:r>
+        <w:t>        "employees</w:t>
+      </w:r>
+      <w:proofErr w:type="gramStart"/>
+      <w:r>
+        <w:t>": {</w:t>
+      </w:r>
+      <w:proofErr w:type="gramEnd"/>
     </w:p>
     <w:p>
       <w:r>
         <w:t>            "</w:t>
       </w:r>
       <w:proofErr w:type="spellStart"/>
-      <w:r>
-        <w:t>direct_employees</w:t>
+      <w:proofErr w:type="gramStart"/>
+      <w:r>
+        <w:t>direct</w:t>
+      </w:r>
+      <w:proofErr w:type="gramEnd"/>
+      <w:r>
+        <w:t>_employees</w:t>
       </w:r>
       <w:proofErr w:type="spellEnd"/>
       <w:r>
@@ -1398,8 +1820,13 @@
         <w:t>            "</w:t>
       </w:r>
       <w:proofErr w:type="spellStart"/>
-      <w:r>
-        <w:t>all_employees</w:t>
+      <w:proofErr w:type="gramStart"/>
+      <w:r>
+        <w:t>all</w:t>
+      </w:r>
+      <w:proofErr w:type="gramEnd"/>
+      <w:r>
+        <w:t>_employees</w:t>
       </w:r>
       <w:proofErr w:type="spellEnd"/>
       <w:r>
@@ -1413,16 +1840,26 @@
     </w:p>
     <w:p>
       <w:r>
-        <w:t>        "devices": {</w:t>
-      </w:r>
+        <w:t>        "devices</w:t>
+      </w:r>
+      <w:proofErr w:type="gramStart"/>
+      <w:r>
+        <w:t>": {</w:t>
+      </w:r>
+      <w:proofErr w:type="gramEnd"/>
     </w:p>
     <w:p>
       <w:r>
         <w:t>            "</w:t>
       </w:r>
       <w:proofErr w:type="spellStart"/>
-      <w:r>
-        <w:t>assigned_devices</w:t>
+      <w:proofErr w:type="gramStart"/>
+      <w:r>
+        <w:t>assigned</w:t>
+      </w:r>
+      <w:proofErr w:type="gramEnd"/>
+      <w:r>
+        <w:t>_devices</w:t>
       </w:r>
       <w:proofErr w:type="spellEnd"/>
       <w:r>
@@ -1436,8 +1873,13 @@
     </w:p>
     <w:p>
       <w:r>
-        <w:t>        "tickets": {</w:t>
-      </w:r>
+        <w:t>        "tickets</w:t>
+      </w:r>
+      <w:proofErr w:type="gramStart"/>
+      <w:r>
+        <w:t>": {</w:t>
+      </w:r>
+      <w:proofErr w:type="gramEnd"/>
     </w:p>
     <w:p>
       <w:r>
@@ -1497,8 +1939,13 @@
     </w:p>
     <w:p/>
     <w:p>
-      <w:r>
-        <w:t xml:space="preserve">Method  GET : </w:t>
+      <w:proofErr w:type="gramStart"/>
+      <w:r>
+        <w:t>Method  GET</w:t>
+      </w:r>
+      <w:proofErr w:type="gramEnd"/>
+      <w:r>
+        <w:t xml:space="preserve"> : </w:t>
       </w:r>
       <w:r>
         <w:t>http://127.0.0.1:8080/api/v1/user/dashboard</w:t>
@@ -1511,21 +1958,36 @@
     </w:p>
     <w:p>
       <w:r>
-        <w:t>    "data": {</w:t>
-      </w:r>
-    </w:p>
-    <w:p>
-      <w:r>
-        <w:t>        "employee": {</w:t>
-      </w:r>
+        <w:t>    "data</w:t>
+      </w:r>
+      <w:proofErr w:type="gramStart"/>
+      <w:r>
+        <w:t>": {</w:t>
+      </w:r>
+      <w:proofErr w:type="gramEnd"/>
+    </w:p>
+    <w:p>
+      <w:r>
+        <w:t>        "employee</w:t>
+      </w:r>
+      <w:proofErr w:type="gramStart"/>
+      <w:r>
+        <w:t>": {</w:t>
+      </w:r>
+      <w:proofErr w:type="gramEnd"/>
     </w:p>
     <w:p>
       <w:r>
         <w:t>            "</w:t>
       </w:r>
       <w:proofErr w:type="spellStart"/>
-      <w:r>
-        <w:t>employee_id</w:t>
+      <w:proofErr w:type="gramStart"/>
+      <w:r>
+        <w:t>employee</w:t>
+      </w:r>
+      <w:proofErr w:type="gramEnd"/>
+      <w:r>
+        <w:t>_id</w:t>
       </w:r>
       <w:proofErr w:type="spellEnd"/>
       <w:r>
@@ -1534,7 +1996,15 @@
     </w:p>
     <w:p>
       <w:r>
-        <w:t>            "employee_name": "Brig Gen Md. Rafiqur Rahman, psc (retd)",</w:t>
+        <w:t>            "</w:t>
+      </w:r>
+      <w:proofErr w:type="gramStart"/>
+      <w:r>
+        <w:t>employee</w:t>
+      </w:r>
+      <w:proofErr w:type="gramEnd"/>
+      <w:r>
+        <w:t>_name": "Brig Gen Md. Rafiqur Rahman, psc (retd)",</w:t>
       </w:r>
     </w:p>
     <w:p>
@@ -1552,8 +2022,13 @@
         <w:t>            "</w:t>
       </w:r>
       <w:proofErr w:type="spellStart"/>
-      <w:r>
-        <w:t>work_field</w:t>
+      <w:proofErr w:type="gramStart"/>
+      <w:r>
+        <w:t>work</w:t>
+      </w:r>
+      <w:proofErr w:type="gramEnd"/>
+      <w:r>
+        <w:t>_field</w:t>
       </w:r>
       <w:proofErr w:type="spellEnd"/>
       <w:r>
@@ -1565,8 +2040,13 @@
         <w:t>            "</w:t>
       </w:r>
       <w:proofErr w:type="spellStart"/>
-      <w:r>
-        <w:t>sub_function</w:t>
+      <w:proofErr w:type="gramStart"/>
+      <w:r>
+        <w:t>sub</w:t>
+      </w:r>
+      <w:proofErr w:type="gramEnd"/>
+      <w:r>
+        <w:t>_function</w:t>
       </w:r>
       <w:proofErr w:type="spellEnd"/>
       <w:r>
@@ -1583,8 +2063,13 @@
         <w:t>            "</w:t>
       </w:r>
       <w:proofErr w:type="spellStart"/>
-      <w:r>
-        <w:t>personal_cell</w:t>
+      <w:proofErr w:type="gramStart"/>
+      <w:r>
+        <w:t>personal</w:t>
+      </w:r>
+      <w:proofErr w:type="gramEnd"/>
+      <w:r>
+        <w:t>_cell</w:t>
       </w:r>
       <w:proofErr w:type="spellEnd"/>
       <w:r>
@@ -1596,8 +2081,13 @@
         <w:t>            "</w:t>
       </w:r>
       <w:proofErr w:type="spellStart"/>
-      <w:r>
-        <w:t>official_cell</w:t>
+      <w:proofErr w:type="gramStart"/>
+      <w:r>
+        <w:t>official</w:t>
+      </w:r>
+      <w:proofErr w:type="gramEnd"/>
+      <w:r>
+        <w:t>_cell</w:t>
       </w:r>
       <w:proofErr w:type="spellEnd"/>
       <w:r>
@@ -1614,8 +2104,13 @@
         <w:t>            "</w:t>
       </w:r>
       <w:proofErr w:type="spellStart"/>
-      <w:r>
-        <w:t>official_email</w:t>
+      <w:proofErr w:type="gramStart"/>
+      <w:r>
+        <w:t>official</w:t>
+      </w:r>
+      <w:proofErr w:type="gramEnd"/>
+      <w:r>
+        <w:t>_email</w:t>
       </w:r>
       <w:proofErr w:type="spellEnd"/>
       <w:r>
@@ -1642,8 +2137,13 @@
     </w:p>
     <w:p>
       <w:r>
-        <w:t>        "tickets": {</w:t>
-      </w:r>
+        <w:t>        "tickets</w:t>
+      </w:r>
+      <w:proofErr w:type="gramStart"/>
+      <w:r>
+        <w:t>": {</w:t>
+      </w:r>
+      <w:proofErr w:type="gramEnd"/>
     </w:p>
     <w:p>
       <w:r>
@@ -1714,21 +2214,36 @@
     </w:p>
     <w:p>
       <w:r>
-        <w:t>    "data": {</w:t>
-      </w:r>
-    </w:p>
-    <w:p>
-      <w:r>
-        <w:t>        "employees": {</w:t>
-      </w:r>
+        <w:t>    "data</w:t>
+      </w:r>
+      <w:proofErr w:type="gramStart"/>
+      <w:r>
+        <w:t>": {</w:t>
+      </w:r>
+      <w:proofErr w:type="gramEnd"/>
+    </w:p>
+    <w:p>
+      <w:r>
+        <w:t>        "employees</w:t>
+      </w:r>
+      <w:proofErr w:type="gramStart"/>
+      <w:r>
+        <w:t>": {</w:t>
+      </w:r>
+      <w:proofErr w:type="gramEnd"/>
     </w:p>
     <w:p>
       <w:r>
         <w:t>            "</w:t>
       </w:r>
       <w:proofErr w:type="spellStart"/>
-      <w:r>
-        <w:t>direct_employees</w:t>
+      <w:proofErr w:type="gramStart"/>
+      <w:r>
+        <w:t>direct</w:t>
+      </w:r>
+      <w:proofErr w:type="gramEnd"/>
+      <w:r>
+        <w:t>_employees</w:t>
       </w:r>
       <w:proofErr w:type="spellEnd"/>
       <w:r>
@@ -1740,8 +2255,13 @@
         <w:t>            "</w:t>
       </w:r>
       <w:proofErr w:type="spellStart"/>
-      <w:r>
-        <w:t>all_employees</w:t>
+      <w:proofErr w:type="gramStart"/>
+      <w:r>
+        <w:t>all</w:t>
+      </w:r>
+      <w:proofErr w:type="gramEnd"/>
+      <w:r>
+        <w:t>_employees</w:t>
       </w:r>
       <w:proofErr w:type="spellEnd"/>
       <w:r>
@@ -1755,16 +2275,26 @@
     </w:p>
     <w:p>
       <w:r>
-        <w:t>        "devices": {</w:t>
-      </w:r>
+        <w:t>        "devices</w:t>
+      </w:r>
+      <w:proofErr w:type="gramStart"/>
+      <w:r>
+        <w:t>": {</w:t>
+      </w:r>
+      <w:proofErr w:type="gramEnd"/>
     </w:p>
     <w:p>
       <w:r>
         <w:t>            "</w:t>
       </w:r>
       <w:proofErr w:type="spellStart"/>
-      <w:r>
-        <w:t>assigned_devices</w:t>
+      <w:proofErr w:type="gramStart"/>
+      <w:r>
+        <w:t>assigned</w:t>
+      </w:r>
+      <w:proofErr w:type="gramEnd"/>
+      <w:r>
+        <w:t>_devices</w:t>
       </w:r>
       <w:proofErr w:type="spellEnd"/>
       <w:r>
@@ -1778,8 +2308,13 @@
     </w:p>
     <w:p>
       <w:r>
-        <w:t>        "tickets": {</w:t>
-      </w:r>
+        <w:t>        "tickets</w:t>
+      </w:r>
+      <w:proofErr w:type="gramStart"/>
+      <w:r>
+        <w:t>": {</w:t>
+      </w:r>
+      <w:proofErr w:type="gramEnd"/>
     </w:p>
     <w:p>
       <w:r>
@@ -2042,6 +2577,104 @@
       </w:r>
     </w:p>
     <w:p/>
+    <w:p/>
+    <w:p/>
+    <w:p/>
+    <w:p/>
+    <w:p/>
+    <w:p/>
+    <w:p/>
+    <w:p/>
+    <w:p/>
+    <w:p/>
+    <w:p/>
+    <w:p/>
+    <w:p/>
+    <w:p/>
+    <w:p>
+      <w:r>
+        <w:t>Sunday</w:t>
+      </w:r>
+    </w:p>
+    <w:p/>
+    <w:p>
+      <w:r>
+        <w:drawing>
+          <wp:inline distT="0" distB="0" distL="0" distR="0" wp14:anchorId="2AB54564" wp14:editId="7A54E6E3">
+            <wp:extent cx="5943600" cy="3012440"/>
+            <wp:effectExtent l="0" t="0" r="0" b="0"/>
+            <wp:docPr id="1637354634" name="Picture 1"/>
+            <wp:cNvGraphicFramePr>
+              <a:graphicFrameLocks xmlns:a="http://schemas.openxmlformats.org/drawingml/2006/main" noChangeAspect="1"/>
+            </wp:cNvGraphicFramePr>
+            <a:graphic xmlns:a="http://schemas.openxmlformats.org/drawingml/2006/main">
+              <a:graphicData uri="http://schemas.openxmlformats.org/drawingml/2006/picture">
+                <pic:pic xmlns:pic="http://schemas.openxmlformats.org/drawingml/2006/picture">
+                  <pic:nvPicPr>
+                    <pic:cNvPr id="1637354634" name=""/>
+                    <pic:cNvPicPr/>
+                  </pic:nvPicPr>
+                  <pic:blipFill>
+                    <a:blip r:embed="rId19"/>
+                    <a:stretch>
+                      <a:fillRect/>
+                    </a:stretch>
+                  </pic:blipFill>
+                  <pic:spPr>
+                    <a:xfrm>
+                      <a:off x="0" y="0"/>
+                      <a:ext cx="5943600" cy="3012440"/>
+                    </a:xfrm>
+                    <a:prstGeom prst="rect">
+                      <a:avLst/>
+                    </a:prstGeom>
+                  </pic:spPr>
+                </pic:pic>
+              </a:graphicData>
+            </a:graphic>
+          </wp:inline>
+        </w:drawing>
+      </w:r>
+    </w:p>
+    <w:p>
+      <w:r>
+        <w:drawing>
+          <wp:inline distT="0" distB="0" distL="0" distR="0" wp14:anchorId="56F658FD" wp14:editId="71ACCEB7">
+            <wp:extent cx="5943600" cy="3012440"/>
+            <wp:effectExtent l="0" t="0" r="0" b="0"/>
+            <wp:docPr id="1931133395" name="Picture 1"/>
+            <wp:cNvGraphicFramePr>
+              <a:graphicFrameLocks xmlns:a="http://schemas.openxmlformats.org/drawingml/2006/main" noChangeAspect="1"/>
+            </wp:cNvGraphicFramePr>
+            <a:graphic xmlns:a="http://schemas.openxmlformats.org/drawingml/2006/main">
+              <a:graphicData uri="http://schemas.openxmlformats.org/drawingml/2006/picture">
+                <pic:pic xmlns:pic="http://schemas.openxmlformats.org/drawingml/2006/picture">
+                  <pic:nvPicPr>
+                    <pic:cNvPr id="1931133395" name=""/>
+                    <pic:cNvPicPr/>
+                  </pic:nvPicPr>
+                  <pic:blipFill>
+                    <a:blip r:embed="rId19"/>
+                    <a:stretch>
+                      <a:fillRect/>
+                    </a:stretch>
+                  </pic:blipFill>
+                  <pic:spPr>
+                    <a:xfrm>
+                      <a:off x="0" y="0"/>
+                      <a:ext cx="5943600" cy="3012440"/>
+                    </a:xfrm>
+                    <a:prstGeom prst="rect">
+                      <a:avLst/>
+                    </a:prstGeom>
+                  </pic:spPr>
+                </pic:pic>
+              </a:graphicData>
+            </a:graphic>
+          </wp:inline>
+        </w:drawing>
+      </w:r>
+    </w:p>
     <w:sectPr>
       <w:pgSz w:w="12240" w:h="15840"/>
       <w:pgMar w:top="1440" w:right="1440" w:bottom="1440" w:left="1440" w:header="720" w:footer="720" w:gutter="0"/>

</xml_diff>